<commit_message>
Add new images for TOC modifications in Pandoc documentation
</commit_message>
<xml_diff>
--- a/docx/tool_pandoc.docx
+++ b/docx/tool_pandoc.docx
@@ -45,16 +45,17 @@
             <w:fldChar w:fldCharType="begin"/>
           </w:r>
           <w:r>
-            <w:instrText>TOC \o "1-3" \h \z \u</w:instrText>
+            <w:instrText xml:space="preserve"> TOC \o "1-3" \h \z \u </w:instrText>
           </w:r>
           <w:r>
             <w:fldChar w:fldCharType="separate"/>
           </w:r>
-          <w:hyperlink w:anchor="_Toc238643871" w:history="1">
+          <w:hyperlink w:anchor="_Toc238657846" w:history="1">
             <w:r>
               <w:rPr>
                 <w:rStyle w:val="ac"/>
                 <w:noProof/>
+                <w:lang w:eastAsia="ko-KR"/>
               </w:rPr>
               <w:t>1</w:t>
             </w:r>
@@ -72,6 +73,7 @@
               <w:rPr>
                 <w:rStyle w:val="ac"/>
                 <w:noProof/>
+                <w:lang w:eastAsia="ko-KR"/>
               </w:rPr>
               <w:t>Pandoc</w:t>
             </w:r>
@@ -94,7 +96,7 @@
                 <w:noProof/>
                 <w:webHidden/>
               </w:rPr>
-              <w:instrText xml:space="preserve"> PAGEREF _Toc238643871 \h </w:instrText>
+              <w:instrText xml:space="preserve"> PAGEREF _Toc238657846 \h </w:instrText>
             </w:r>
             <w:r>
               <w:rPr>
@@ -141,11 +143,12 @@
               <w14:ligatures w14:val="standardContextual"/>
             </w:rPr>
           </w:pPr>
-          <w:hyperlink w:anchor="_Toc238643872" w:history="1">
+          <w:hyperlink w:anchor="_Toc238657847" w:history="1">
             <w:r>
               <w:rPr>
                 <w:rStyle w:val="ac"/>
                 <w:noProof/>
+                <w:lang w:eastAsia="ko-KR"/>
               </w:rPr>
               <w:t>2</w:t>
             </w:r>
@@ -163,6 +166,7 @@
               <w:rPr>
                 <w:rStyle w:val="ac"/>
                 <w:noProof/>
+                <w:lang w:eastAsia="ko-KR"/>
               </w:rPr>
               <w:t>Install pandoc</w:t>
             </w:r>
@@ -185,7 +189,7 @@
                 <w:noProof/>
                 <w:webHidden/>
               </w:rPr>
-              <w:instrText xml:space="preserve"> PAGEREF _Toc238643872 \h </w:instrText>
+              <w:instrText xml:space="preserve"> PAGEREF _Toc238657847 \h </w:instrText>
             </w:r>
             <w:r>
               <w:rPr>
@@ -232,7 +236,7 @@
               <w14:ligatures w14:val="standardContextual"/>
             </w:rPr>
           </w:pPr>
-          <w:hyperlink w:anchor="_Toc238643873" w:history="1">
+          <w:hyperlink w:anchor="_Toc238657848" w:history="1">
             <w:r>
               <w:rPr>
                 <w:rStyle w:val="ac"/>
@@ -276,7 +280,7 @@
                 <w:noProof/>
                 <w:webHidden/>
               </w:rPr>
-              <w:instrText xml:space="preserve"> PAGEREF _Toc238643873 \h </w:instrText>
+              <w:instrText xml:space="preserve"> PAGEREF _Toc238657848 \h </w:instrText>
             </w:r>
             <w:r>
               <w:rPr>
@@ -323,7 +327,7 @@
               <w14:ligatures w14:val="standardContextual"/>
             </w:rPr>
           </w:pPr>
-          <w:hyperlink w:anchor="_Toc238643874" w:history="1">
+          <w:hyperlink w:anchor="_Toc238657849" w:history="1">
             <w:r>
               <w:rPr>
                 <w:rStyle w:val="ac"/>
@@ -367,7 +371,7 @@
                 <w:noProof/>
                 <w:webHidden/>
               </w:rPr>
-              <w:instrText xml:space="preserve"> PAGEREF _Toc238643874 \h </w:instrText>
+              <w:instrText xml:space="preserve"> PAGEREF _Toc238657849 \h </w:instrText>
             </w:r>
             <w:r>
               <w:rPr>
@@ -387,7 +391,7 @@
                 <w:noProof/>
                 <w:webHidden/>
               </w:rPr>
-              <w:t>3</w:t>
+              <w:t>2</w:t>
             </w:r>
             <w:r>
               <w:rPr>
@@ -414,11 +418,12 @@
               <w14:ligatures w14:val="standardContextual"/>
             </w:rPr>
           </w:pPr>
-          <w:hyperlink w:anchor="_Toc238643875" w:history="1">
+          <w:hyperlink w:anchor="_Toc238657850" w:history="1">
             <w:r>
               <w:rPr>
                 <w:rStyle w:val="ac"/>
                 <w:noProof/>
+                <w:lang w:eastAsia="ko-KR"/>
               </w:rPr>
               <w:t>3.1</w:t>
             </w:r>
@@ -436,6 +441,7 @@
               <w:rPr>
                 <w:rStyle w:val="ac"/>
                 <w:noProof/>
+                <w:lang w:eastAsia="ko-KR"/>
               </w:rPr>
               <w:t>Modify Reference</w:t>
             </w:r>
@@ -458,7 +464,7 @@
                 <w:noProof/>
                 <w:webHidden/>
               </w:rPr>
-              <w:instrText xml:space="preserve"> PAGEREF _Toc238643875 \h </w:instrText>
+              <w:instrText xml:space="preserve"> PAGEREF _Toc238657850 \h </w:instrText>
             </w:r>
             <w:r>
               <w:rPr>
@@ -505,11 +511,12 @@
               <w14:ligatures w14:val="standardContextual"/>
             </w:rPr>
           </w:pPr>
-          <w:hyperlink w:anchor="_Toc238643876" w:history="1">
+          <w:hyperlink w:anchor="_Toc238657851" w:history="1">
             <w:r>
               <w:rPr>
                 <w:rStyle w:val="ac"/>
                 <w:noProof/>
+                <w:lang w:eastAsia="ko-KR"/>
               </w:rPr>
               <w:t>3.2</w:t>
             </w:r>
@@ -527,6 +534,7 @@
               <w:rPr>
                 <w:rStyle w:val="ac"/>
                 <w:noProof/>
+                <w:lang w:eastAsia="ko-KR"/>
               </w:rPr>
               <w:t>Modify Style</w:t>
             </w:r>
@@ -549,7 +557,7 @@
                 <w:noProof/>
                 <w:webHidden/>
               </w:rPr>
-              <w:instrText xml:space="preserve"> PAGEREF _Toc238643876 \h </w:instrText>
+              <w:instrText xml:space="preserve"> PAGEREF _Toc238657851 \h </w:instrText>
             </w:r>
             <w:r>
               <w:rPr>
@@ -596,7 +604,7 @@
               <w14:ligatures w14:val="standardContextual"/>
             </w:rPr>
           </w:pPr>
-          <w:hyperlink w:anchor="_Toc238643877" w:history="1">
+          <w:hyperlink w:anchor="_Toc238657852" w:history="1">
             <w:r>
               <w:rPr>
                 <w:rStyle w:val="ac"/>
@@ -640,7 +648,7 @@
                 <w:noProof/>
                 <w:webHidden/>
               </w:rPr>
-              <w:instrText xml:space="preserve"> PAGEREF _Toc238643877 \h </w:instrText>
+              <w:instrText xml:space="preserve"> PAGEREF _Toc238657852 \h </w:instrText>
             </w:r>
             <w:r>
               <w:rPr>
@@ -687,7 +695,7 @@
               <w14:ligatures w14:val="standardContextual"/>
             </w:rPr>
           </w:pPr>
-          <w:hyperlink w:anchor="_Toc238643878" w:history="1">
+          <w:hyperlink w:anchor="_Toc238657853" w:history="1">
             <w:r>
               <w:rPr>
                 <w:rStyle w:val="ac"/>
@@ -731,7 +739,7 @@
                 <w:noProof/>
                 <w:webHidden/>
               </w:rPr>
-              <w:instrText xml:space="preserve"> PAGEREF _Toc238643878 \h </w:instrText>
+              <w:instrText xml:space="preserve"> PAGEREF _Toc238657853 \h </w:instrText>
             </w:r>
             <w:r>
               <w:rPr>
@@ -778,11 +786,12 @@
               <w14:ligatures w14:val="standardContextual"/>
             </w:rPr>
           </w:pPr>
-          <w:hyperlink w:anchor="_Toc238643879" w:history="1">
+          <w:hyperlink w:anchor="_Toc238657854" w:history="1">
             <w:r>
               <w:rPr>
                 <w:rStyle w:val="ac"/>
                 <w:noProof/>
+                <w:lang w:eastAsia="ko-KR"/>
               </w:rPr>
               <w:t>4.1</w:t>
             </w:r>
@@ -800,6 +809,7 @@
               <w:rPr>
                 <w:rStyle w:val="ac"/>
                 <w:noProof/>
+                <w:lang w:eastAsia="ko-KR"/>
               </w:rPr>
               <w:t>Check XML</w:t>
             </w:r>
@@ -822,7 +832,7 @@
                 <w:noProof/>
                 <w:webHidden/>
               </w:rPr>
-              <w:instrText xml:space="preserve"> PAGEREF _Toc238643879 \h </w:instrText>
+              <w:instrText xml:space="preserve"> PAGEREF _Toc238657854 \h </w:instrText>
             </w:r>
             <w:r>
               <w:rPr>
@@ -869,7 +879,7 @@
               <w14:ligatures w14:val="standardContextual"/>
             </w:rPr>
           </w:pPr>
-          <w:hyperlink w:anchor="_Toc238643880" w:history="1">
+          <w:hyperlink w:anchor="_Toc238657855" w:history="1">
             <w:r>
               <w:rPr>
                 <w:rStyle w:val="ac"/>
@@ -913,7 +923,7 @@
                 <w:noProof/>
                 <w:webHidden/>
               </w:rPr>
-              <w:instrText xml:space="preserve"> PAGEREF _Toc238643880 \h </w:instrText>
+              <w:instrText xml:space="preserve"> PAGEREF _Toc238657855 \h </w:instrText>
             </w:r>
             <w:r>
               <w:rPr>
@@ -960,7 +970,7 @@
               <w14:ligatures w14:val="standardContextual"/>
             </w:rPr>
           </w:pPr>
-          <w:hyperlink w:anchor="_Toc238643881" w:history="1">
+          <w:hyperlink w:anchor="_Toc238657856" w:history="1">
             <w:r>
               <w:rPr>
                 <w:rStyle w:val="ac"/>
@@ -1004,7 +1014,7 @@
                 <w:noProof/>
                 <w:webHidden/>
               </w:rPr>
-              <w:instrText xml:space="preserve"> PAGEREF _Toc238643881 \h </w:instrText>
+              <w:instrText xml:space="preserve"> PAGEREF _Toc238657856 \h </w:instrText>
             </w:r>
             <w:r>
               <w:rPr>
@@ -1051,7 +1061,7 @@
               <w14:ligatures w14:val="standardContextual"/>
             </w:rPr>
           </w:pPr>
-          <w:hyperlink w:anchor="_Toc238643882" w:history="1">
+          <w:hyperlink w:anchor="_Toc238657857" w:history="1">
             <w:r>
               <w:rPr>
                 <w:rStyle w:val="ac"/>
@@ -1095,7 +1105,7 @@
                 <w:noProof/>
                 <w:webHidden/>
               </w:rPr>
-              <w:instrText xml:space="preserve"> PAGEREF _Toc238643882 \h </w:instrText>
+              <w:instrText xml:space="preserve"> PAGEREF _Toc238657857 \h </w:instrText>
             </w:r>
             <w:r>
               <w:rPr>
@@ -1142,7 +1152,7 @@
               <w14:ligatures w14:val="standardContextual"/>
             </w:rPr>
           </w:pPr>
-          <w:hyperlink w:anchor="_Toc238643883" w:history="1">
+          <w:hyperlink w:anchor="_Toc238657858" w:history="1">
             <w:r>
               <w:rPr>
                 <w:rStyle w:val="ac"/>
@@ -1186,7 +1196,7 @@
                 <w:noProof/>
                 <w:webHidden/>
               </w:rPr>
-              <w:instrText xml:space="preserve"> PAGEREF _Toc238643883 \h </w:instrText>
+              <w:instrText xml:space="preserve"> PAGEREF _Toc238657858 \h </w:instrText>
             </w:r>
             <w:r>
               <w:rPr>
@@ -1233,7 +1243,7 @@
               <w14:ligatures w14:val="standardContextual"/>
             </w:rPr>
           </w:pPr>
-          <w:hyperlink w:anchor="_Toc238643884" w:history="1">
+          <w:hyperlink w:anchor="_Toc238657859" w:history="1">
             <w:r>
               <w:rPr>
                 <w:rStyle w:val="ac"/>
@@ -1277,7 +1287,7 @@
                 <w:noProof/>
                 <w:webHidden/>
               </w:rPr>
-              <w:instrText xml:space="preserve"> PAGEREF _Toc238643884 \h </w:instrText>
+              <w:instrText xml:space="preserve"> PAGEREF _Toc238657859 \h </w:instrText>
             </w:r>
             <w:r>
               <w:rPr>
@@ -1297,7 +1307,7 @@
                 <w:noProof/>
                 <w:webHidden/>
               </w:rPr>
-              <w:t>19</w:t>
+              <w:t>18</w:t>
             </w:r>
             <w:r>
               <w:rPr>
@@ -1323,7 +1333,7 @@
         </w:rPr>
       </w:pPr>
       <w:bookmarkStart w:id="0" w:name="pandoc"/>
-      <w:bookmarkStart w:id="1" w:name="_Toc238643871"/>
+      <w:bookmarkStart w:id="1" w:name="_Toc238657846"/>
       <w:r>
         <w:rPr>
           <w:rStyle w:val="SectionNumber"/>
@@ -1629,7 +1639,7 @@
       <w:pPr>
         <w:pStyle w:val="a0"/>
       </w:pPr>
-      <w:hyperlink r:id="rId7">
+      <w:hyperlink r:id="rId8">
         <w:r>
           <w:rPr>
             <w:rStyle w:val="ac"/>
@@ -1889,7 +1899,7 @@
         </w:rPr>
       </w:pPr>
       <w:bookmarkStart w:id="2" w:name="install-pandoc"/>
-      <w:bookmarkStart w:id="3" w:name="_Toc238643872"/>
+      <w:bookmarkStart w:id="3" w:name="_Toc238657847"/>
       <w:bookmarkEnd w:id="0"/>
       <w:r>
         <w:rPr>
@@ -2046,7 +2056,7 @@
         <w:pStyle w:val="3"/>
       </w:pPr>
       <w:bookmarkStart w:id="4" w:name="windows"/>
-      <w:bookmarkStart w:id="5" w:name="_Toc238643873"/>
+      <w:bookmarkStart w:id="5" w:name="_Toc238657848"/>
       <w:r>
         <w:rPr>
           <w:rStyle w:val="SectionNumber"/>
@@ -2298,7 +2308,7 @@
         <w:pStyle w:val="2"/>
       </w:pPr>
       <w:bookmarkStart w:id="6" w:name="make-reference"/>
-      <w:bookmarkStart w:id="7" w:name="_Toc238643874"/>
+      <w:bookmarkStart w:id="7" w:name="_Toc238657849"/>
       <w:bookmarkEnd w:id="2"/>
       <w:bookmarkEnd w:id="4"/>
       <w:r>
@@ -2744,7 +2754,7 @@
                     </pic:cNvPicPr>
                   </pic:nvPicPr>
                   <pic:blipFill>
-                    <a:blip r:embed="rId8"/>
+                    <a:blip r:embed="rId9"/>
                     <a:stretch>
                       <a:fillRect/>
                     </a:stretch>
@@ -2796,7 +2806,7 @@
                     </pic:cNvPicPr>
                   </pic:nvPicPr>
                   <pic:blipFill>
-                    <a:blip r:embed="rId9"/>
+                    <a:blip r:embed="rId10"/>
                     <a:stretch>
                       <a:fillRect/>
                     </a:stretch>
@@ -2839,7 +2849,7 @@
         </w:rPr>
       </w:pPr>
       <w:bookmarkStart w:id="8" w:name="modify-reference"/>
-      <w:bookmarkStart w:id="9" w:name="_Toc238643875"/>
+      <w:bookmarkStart w:id="9" w:name="_Toc238657850"/>
       <w:r>
         <w:rPr>
           <w:rStyle w:val="SectionNumber"/>
@@ -3645,7 +3655,7 @@
         </w:rPr>
       </w:pPr>
       <w:bookmarkStart w:id="10" w:name="modify-style"/>
-      <w:bookmarkStart w:id="11" w:name="_Toc238643876"/>
+      <w:bookmarkStart w:id="11" w:name="_Toc238657851"/>
       <w:bookmarkEnd w:id="8"/>
       <w:r>
         <w:rPr>
@@ -4006,7 +4016,7 @@
                     </pic:cNvPicPr>
                   </pic:nvPicPr>
                   <pic:blipFill>
-                    <a:blip r:embed="rId10"/>
+                    <a:blip r:embed="rId11"/>
                     <a:stretch>
                       <a:fillRect/>
                     </a:stretch>
@@ -4055,7 +4065,7 @@
                     </pic:cNvPicPr>
                   </pic:nvPicPr>
                   <pic:blipFill>
-                    <a:blip r:embed="rId11"/>
+                    <a:blip r:embed="rId12"/>
                     <a:stretch>
                       <a:fillRect/>
                     </a:stretch>
@@ -4221,7 +4231,7 @@
                     </pic:cNvPicPr>
                   </pic:nvPicPr>
                   <pic:blipFill>
-                    <a:blip r:embed="rId12"/>
+                    <a:blip r:embed="rId13"/>
                     <a:stretch>
                       <a:fillRect/>
                     </a:stretch>
@@ -4356,7 +4366,7 @@
                     </pic:cNvPicPr>
                   </pic:nvPicPr>
                   <pic:blipFill>
-                    <a:blip r:embed="rId13"/>
+                    <a:blip r:embed="rId14"/>
                     <a:stretch>
                       <a:fillRect/>
                     </a:stretch>
@@ -4393,7 +4403,7 @@
         <w:pStyle w:val="3"/>
       </w:pPr>
       <w:bookmarkStart w:id="12" w:name="modify-matrix"/>
-      <w:bookmarkStart w:id="13" w:name="_Toc238643877"/>
+      <w:bookmarkStart w:id="13" w:name="_Toc238657852"/>
       <w:bookmarkEnd w:id="10"/>
       <w:r>
         <w:rPr>
@@ -4474,7 +4484,7 @@
                     </pic:cNvPicPr>
                   </pic:nvPicPr>
                   <pic:blipFill>
-                    <a:blip r:embed="rId14"/>
+                    <a:blip r:embed="rId15"/>
                     <a:stretch>
                       <a:fillRect/>
                     </a:stretch>
@@ -4528,7 +4538,7 @@
                     </pic:cNvPicPr>
                   </pic:nvPicPr>
                   <pic:blipFill>
-                    <a:blip r:embed="rId15"/>
+                    <a:blip r:embed="rId16"/>
                     <a:stretch>
                       <a:fillRect/>
                     </a:stretch>
@@ -5032,7 +5042,7 @@
                     </pic:cNvPicPr>
                   </pic:nvPicPr>
                   <pic:blipFill>
-                    <a:blip r:embed="rId16"/>
+                    <a:blip r:embed="rId17"/>
                     <a:stretch>
                       <a:fillRect/>
                     </a:stretch>
@@ -5243,7 +5253,7 @@
                     </pic:cNvPicPr>
                   </pic:nvPicPr>
                   <pic:blipFill>
-                    <a:blip r:embed="rId17"/>
+                    <a:blip r:embed="rId18"/>
                     <a:stretch>
                       <a:fillRect/>
                     </a:stretch>
@@ -5509,7 +5519,7 @@
         <w:pStyle w:val="2"/>
       </w:pPr>
       <w:bookmarkStart w:id="14" w:name="check-docxpptx"/>
-      <w:bookmarkStart w:id="15" w:name="_Toc238643878"/>
+      <w:bookmarkStart w:id="15" w:name="_Toc238657853"/>
       <w:bookmarkEnd w:id="6"/>
       <w:bookmarkEnd w:id="12"/>
       <w:r>
@@ -5818,7 +5828,7 @@
         </w:rPr>
       </w:pPr>
       <w:bookmarkStart w:id="16" w:name="check-xml"/>
-      <w:bookmarkStart w:id="17" w:name="_Toc238643879"/>
+      <w:bookmarkStart w:id="17" w:name="_Toc238657854"/>
       <w:r>
         <w:rPr>
           <w:rStyle w:val="SectionNumber"/>
@@ -6074,7 +6084,7 @@
         <w:pStyle w:val="2"/>
       </w:pPr>
       <w:bookmarkStart w:id="18" w:name="pandoc-build"/>
-      <w:bookmarkStart w:id="19" w:name="_Toc238643880"/>
+      <w:bookmarkStart w:id="19" w:name="_Toc238657855"/>
       <w:bookmarkEnd w:id="14"/>
       <w:bookmarkEnd w:id="16"/>
       <w:r>
@@ -6094,7 +6104,7 @@
         <w:pStyle w:val="3"/>
       </w:pPr>
       <w:bookmarkStart w:id="20" w:name="convert-to-pptx"/>
-      <w:bookmarkStart w:id="21" w:name="_Toc238643881"/>
+      <w:bookmarkStart w:id="21" w:name="_Toc238657856"/>
       <w:r>
         <w:rPr>
           <w:rStyle w:val="SectionNumber"/>
@@ -6278,7 +6288,7 @@
         <w:pStyle w:val="3"/>
       </w:pPr>
       <w:bookmarkStart w:id="22" w:name="convert-to-docx"/>
-      <w:bookmarkStart w:id="23" w:name="_Toc238643882"/>
+      <w:bookmarkStart w:id="23" w:name="_Toc238657857"/>
       <w:bookmarkEnd w:id="20"/>
       <w:r>
         <w:rPr>
@@ -6471,7 +6481,7 @@
         <w:pStyle w:val="2"/>
       </w:pPr>
       <w:bookmarkStart w:id="24" w:name="mermaid-build"/>
-      <w:bookmarkStart w:id="25" w:name="_Toc238643883"/>
+      <w:bookmarkStart w:id="25" w:name="_Toc238657858"/>
       <w:bookmarkEnd w:id="18"/>
       <w:bookmarkEnd w:id="22"/>
       <w:r>
@@ -6524,7 +6534,7 @@
       <w:pPr>
         <w:pStyle w:val="a0"/>
       </w:pPr>
-      <w:hyperlink r:id="rId18" w:anchor="mermaid-build">
+      <w:hyperlink r:id="rId19" w:anchor="mermaid-build">
         <w:r>
           <w:rPr>
             <w:rStyle w:val="ac"/>
@@ -6670,7 +6680,7 @@
         <w:pStyle w:val="3"/>
       </w:pPr>
       <w:bookmarkStart w:id="26" w:name="convert-mermaid-to-svg"/>
-      <w:bookmarkStart w:id="27" w:name="_Toc238643884"/>
+      <w:bookmarkStart w:id="27" w:name="_Toc238657859"/>
       <w:r>
         <w:rPr>
           <w:rStyle w:val="SectionNumber"/>
@@ -8433,6 +8443,13 @@
     <w:basedOn w:val="a1"/>
     <w:link w:val="ae"/>
     <w:rsid w:val="00502AC2"/>
+  </w:style>
+  <w:style w:type="paragraph" w:styleId="10">
+    <w:name w:val="toc 1"/>
+    <w:basedOn w:val="a"/>
+    <w:next w:val="a"/>
+    <w:autoRedefine/>
+    <w:rsid w:val="00D35420"/>
   </w:style>
 </w:styles>
 </file>
@@ -8730,4 +8747,16 @@
     </a:ext>
   </a:extLst>
 </a:theme>
+</file>
+
+<file path=customXml/item1.xml><?xml version="1.0" encoding="utf-8"?>
+<b:Sources xmlns:b="http://schemas.openxmlformats.org/officeDocument/2006/bibliography" xmlns="http://schemas.openxmlformats.org/officeDocument/2006/bibliography" SelectedStyle="\APASixthEditionOfficeOnline.xsl" StyleName="APA" Version="6"/>
+</file>
+
+<file path=customXml/itemProps1.xml><?xml version="1.0" encoding="utf-8"?>
+<ds:datastoreItem xmlns:ds="http://schemas.openxmlformats.org/officeDocument/2006/customXml" ds:itemID="{B41086F9-EFE2-425F-AFF2-5F481FAC3812}">
+  <ds:schemaRefs>
+    <ds:schemaRef ds:uri="http://schemas.openxmlformats.org/officeDocument/2006/bibliography"/>
+  </ds:schemaRefs>
+</ds:datastoreItem>
 </file>
</xml_diff>

<commit_message>
Add Lua filter and metadata support for Pandoc DOCX output
</commit_message>
<xml_diff>
--- a/docx/tool_pandoc.docx
+++ b/docx/tool_pandoc.docx
@@ -28,7 +28,7 @@
         </w:p>
       </w:sdtContent>
     </w:sdt>
-    <w:bookmarkStart w:id="37" w:name="pandoc"/>
+    <w:bookmarkStart w:id="38" w:name="pandoc"/>
     <w:p>
       <w:pPr>
         <w:pStyle w:val="2"/>
@@ -69,7 +69,7 @@
       <w:pPr>
         <w:pStyle w:val="a0"/>
       </w:pPr>
-      <w:hyperlink r:id="rId35">
+      <w:hyperlink r:id="rId36">
         <w:r>
           <w:rPr>
             <w:rStyle w:val="ac"/>
@@ -105,7 +105,7 @@
         <w:pStyle w:val="FirstParagraph"/>
       </w:pPr>
     </w:p>
-    <w:bookmarkStart w:id="36" w:name="mkdocs-to-pandoc"/>
+    <w:bookmarkStart w:id="37" w:name="mkdocs-to-pandoc"/>
     <w:p>
       <w:pPr>
         <w:pStyle w:val="3"/>
@@ -199,9 +199,9 @@
         <w:pStyle w:val="FirstParagraph"/>
       </w:pPr>
     </w:p>
-    <w:bookmarkEnd w:id="36"/>
     <w:bookmarkEnd w:id="37"/>
-    <w:bookmarkStart w:id="39" w:name="install-pandoc"/>
+    <w:bookmarkEnd w:id="38"/>
+    <w:bookmarkStart w:id="40" w:name="install-pandoc"/>
     <w:p>
       <w:pPr>
         <w:pStyle w:val="2"/>
@@ -237,7 +237,7 @@
         <w:pStyle w:val="a0"/>
       </w:pPr>
     </w:p>
-    <w:bookmarkStart w:id="38" w:name="windows"/>
+    <w:bookmarkStart w:id="39" w:name="windows"/>
     <w:p>
       <w:pPr>
         <w:pStyle w:val="3"/>
@@ -368,9 +368,9 @@
         </w:pict>
       </w:r>
     </w:p>
-    <w:bookmarkEnd w:id="38"/>
     <w:bookmarkEnd w:id="39"/>
-    <w:bookmarkStart w:id="93" w:name="make-reference"/>
+    <w:bookmarkEnd w:id="40"/>
+    <w:bookmarkStart w:id="113" w:name="make-reference"/>
     <w:p>
       <w:pPr>
         <w:pStyle w:val="2"/>
@@ -519,18 +519,18 @@
           <wp:inline>
             <wp:extent cx="5943600" cy="4560862"/>
             <wp:effectExtent b="0" l="0" r="0" t="0"/>
-            <wp:docPr descr="" title="" id="41" name="Picture"/>
+            <wp:docPr descr="" title="" id="42" name="Picture"/>
             <a:graphic>
               <a:graphicData uri="http://schemas.openxmlformats.org/drawingml/2006/picture">
                 <pic:pic>
                   <pic:nvPicPr>
-                    <pic:cNvPr descr="./imgs/tool_pandoc_docx_00.png" id="42" name="Picture"/>
+                    <pic:cNvPr descr="./imgs/tool_pandoc_docx_00.png" id="43" name="Picture"/>
                     <pic:cNvPicPr>
                       <a:picLocks noChangeArrowheads="1" noChangeAspect="1"/>
                     </pic:cNvPicPr>
                   </pic:nvPicPr>
                   <pic:blipFill>
-                    <a:blip r:embed="rId40"/>
+                    <a:blip r:embed="rId41"/>
                     <a:stretch>
                       <a:fillRect/>
                     </a:stretch>
@@ -564,18 +564,18 @@
           <wp:inline>
             <wp:extent cx="5943600" cy="3267693"/>
             <wp:effectExtent b="0" l="0" r="0" t="0"/>
-            <wp:docPr descr="" title="" id="44" name="Picture"/>
+            <wp:docPr descr="" title="" id="45" name="Picture"/>
             <a:graphic>
               <a:graphicData uri="http://schemas.openxmlformats.org/drawingml/2006/picture">
                 <pic:pic>
                   <pic:nvPicPr>
-                    <pic:cNvPr descr="./imgs/tool_pandoc_ppt_00.png" id="45" name="Picture"/>
+                    <pic:cNvPr descr="./imgs/tool_pandoc_ppt_00.png" id="46" name="Picture"/>
                     <pic:cNvPicPr>
                       <a:picLocks noChangeArrowheads="1" noChangeAspect="1"/>
                     </pic:cNvPicPr>
                   </pic:nvPicPr>
                   <pic:blipFill>
-                    <a:blip r:embed="rId43"/>
+                    <a:blip r:embed="rId44"/>
                     <a:stretch>
                       <a:fillRect/>
                     </a:stretch>
@@ -607,7 +607,7 @@
         <w:pStyle w:val="a0"/>
       </w:pPr>
     </w:p>
-    <w:bookmarkStart w:id="52" w:name="머리글바닥글"/>
+    <w:bookmarkStart w:id="53" w:name="머리글바닥글"/>
     <w:p>
       <w:pPr>
         <w:pStyle w:val="3"/>
@@ -639,18 +639,18 @@
           <wp:inline>
             <wp:extent cx="5943600" cy="6614245"/>
             <wp:effectExtent b="0" l="0" r="0" t="0"/>
-            <wp:docPr descr="" title="" id="47" name="Picture"/>
+            <wp:docPr descr="" title="" id="48" name="Picture"/>
             <a:graphic>
               <a:graphicData uri="http://schemas.openxmlformats.org/drawingml/2006/picture">
                 <pic:pic>
                   <pic:nvPicPr>
-                    <pic:cNvPr descr="./imgs/tool_pandoc_docx_01.png" id="48" name="Picture"/>
+                    <pic:cNvPr descr="./imgs/tool_pandoc_docx_01.png" id="49" name="Picture"/>
                     <pic:cNvPicPr>
                       <a:picLocks noChangeArrowheads="1" noChangeAspect="1"/>
                     </pic:cNvPicPr>
                   </pic:nvPicPr>
                   <pic:blipFill>
-                    <a:blip r:embed="rId46"/>
+                    <a:blip r:embed="rId47"/>
                     <a:stretch>
                       <a:fillRect/>
                     </a:stretch>
@@ -720,18 +720,18 @@
           <wp:inline>
             <wp:extent cx="5943600" cy="524553"/>
             <wp:effectExtent b="0" l="0" r="0" t="0"/>
-            <wp:docPr descr="" title="" id="50" name="Picture"/>
+            <wp:docPr descr="" title="" id="51" name="Picture"/>
             <a:graphic>
               <a:graphicData uri="http://schemas.openxmlformats.org/drawingml/2006/picture">
                 <pic:pic>
                   <pic:nvPicPr>
-                    <pic:cNvPr descr="./imgs/tool_pandoc_docx_04.png" id="51" name="Picture"/>
+                    <pic:cNvPr descr="./imgs/tool_pandoc_docx_04.png" id="52" name="Picture"/>
                     <pic:cNvPicPr>
                       <a:picLocks noChangeArrowheads="1" noChangeAspect="1"/>
                     </pic:cNvPicPr>
                   </pic:nvPicPr>
                   <pic:blipFill>
-                    <a:blip r:embed="rId49"/>
+                    <a:blip r:embed="rId50"/>
                     <a:stretch>
                       <a:fillRect/>
                     </a:stretch>
@@ -763,8 +763,8 @@
         <w:pStyle w:val="a0"/>
       </w:pPr>
     </w:p>
-    <w:bookmarkEnd w:id="52"/>
-    <w:bookmarkStart w:id="53" w:name="modify-reference"/>
+    <w:bookmarkEnd w:id="53"/>
+    <w:bookmarkStart w:id="54" w:name="modify-reference"/>
     <w:p>
       <w:pPr>
         <w:pStyle w:val="3"/>
@@ -879,8 +879,8 @@
         <w:pStyle w:val="FirstParagraph"/>
       </w:pPr>
     </w:p>
-    <w:bookmarkEnd w:id="53"/>
-    <w:bookmarkStart w:id="66" w:name="modify-style"/>
+    <w:bookmarkEnd w:id="54"/>
+    <w:bookmarkStart w:id="67" w:name="modify-style"/>
     <w:p>
       <w:pPr>
         <w:pStyle w:val="3"/>
@@ -1006,18 +1006,18 @@
           <wp:inline>
             <wp:extent cx="2049021" cy="2202219"/>
             <wp:effectExtent b="0" l="0" r="0" t="0"/>
-            <wp:docPr descr="" title="" id="55" name="Picture"/>
+            <wp:docPr descr="" title="" id="56" name="Picture"/>
             <a:graphic>
               <a:graphicData uri="http://schemas.openxmlformats.org/drawingml/2006/picture">
                 <pic:pic>
                   <pic:nvPicPr>
-                    <pic:cNvPr descr="./imgs/pandoc_docx_00.png" id="56" name="Picture"/>
+                    <pic:cNvPr descr="./imgs/pandoc_docx_00.png" id="57" name="Picture"/>
                     <pic:cNvPicPr>
                       <a:picLocks noChangeArrowheads="1" noChangeAspect="1"/>
                     </pic:cNvPicPr>
                   </pic:nvPicPr>
                   <pic:blipFill>
-                    <a:blip r:embed="rId54"/>
+                    <a:blip r:embed="rId55"/>
                     <a:stretch>
                       <a:fillRect/>
                     </a:stretch>
@@ -1051,18 +1051,18 @@
           <wp:inline>
             <wp:extent cx="1972423" cy="2250094"/>
             <wp:effectExtent b="0" l="0" r="0" t="0"/>
-            <wp:docPr descr="" title="" id="58" name="Picture"/>
+            <wp:docPr descr="" title="" id="59" name="Picture"/>
             <a:graphic>
               <a:graphicData uri="http://schemas.openxmlformats.org/drawingml/2006/picture">
                 <pic:pic>
                   <pic:nvPicPr>
-                    <pic:cNvPr descr="./imgs/pandoc_docx_03.png" id="59" name="Picture"/>
+                    <pic:cNvPr descr="./imgs/pandoc_docx_03.png" id="60" name="Picture"/>
                     <pic:cNvPicPr>
                       <a:picLocks noChangeArrowheads="1" noChangeAspect="1"/>
                     </pic:cNvPicPr>
                   </pic:nvPicPr>
                   <pic:blipFill>
-                    <a:blip r:embed="rId57"/>
+                    <a:blip r:embed="rId58"/>
                     <a:stretch>
                       <a:fillRect/>
                     </a:stretch>
@@ -1139,18 +1139,18 @@
           <wp:inline>
             <wp:extent cx="5505549" cy="6166215"/>
             <wp:effectExtent b="0" l="0" r="0" t="0"/>
-            <wp:docPr descr="" title="" id="61" name="Picture"/>
+            <wp:docPr descr="" title="" id="62" name="Picture"/>
             <a:graphic>
               <a:graphicData uri="http://schemas.openxmlformats.org/drawingml/2006/picture">
                 <pic:pic>
                   <pic:nvPicPr>
-                    <pic:cNvPr descr="./imgs/pandoc_docx_01.png" id="62" name="Picture"/>
+                    <pic:cNvPr descr="./imgs/pandoc_docx_01.png" id="63" name="Picture"/>
                     <pic:cNvPicPr>
                       <a:picLocks noChangeArrowheads="1" noChangeAspect="1"/>
                     </pic:cNvPicPr>
                   </pic:nvPicPr>
                   <pic:blipFill>
-                    <a:blip r:embed="rId60"/>
+                    <a:blip r:embed="rId61"/>
                     <a:stretch>
                       <a:fillRect/>
                     </a:stretch>
@@ -1227,18 +1227,18 @@
           <wp:inline>
             <wp:extent cx="5534274" cy="6175790"/>
             <wp:effectExtent b="0" l="0" r="0" t="0"/>
-            <wp:docPr descr="" title="" id="64" name="Picture"/>
+            <wp:docPr descr="" title="" id="65" name="Picture"/>
             <a:graphic>
               <a:graphicData uri="http://schemas.openxmlformats.org/drawingml/2006/picture">
                 <pic:pic>
                   <pic:nvPicPr>
-                    <pic:cNvPr descr="./imgs/pandoc_docx_02.png" id="65" name="Picture"/>
+                    <pic:cNvPr descr="./imgs/pandoc_docx_02.png" id="66" name="Picture"/>
                     <pic:cNvPicPr>
                       <a:picLocks noChangeArrowheads="1" noChangeAspect="1"/>
                     </pic:cNvPicPr>
                   </pic:nvPicPr>
                   <pic:blipFill>
-                    <a:blip r:embed="rId63"/>
+                    <a:blip r:embed="rId64"/>
                     <a:stretch>
                       <a:fillRect/>
                     </a:stretch>
@@ -1270,8 +1270,8 @@
         <w:pStyle w:val="FirstParagraph"/>
       </w:pPr>
     </w:p>
-    <w:bookmarkEnd w:id="66"/>
-    <w:bookmarkStart w:id="85" w:name="modify-matrix"/>
+    <w:bookmarkEnd w:id="67"/>
+    <w:bookmarkStart w:id="77" w:name="modify-style-font"/>
     <w:p>
       <w:pPr>
         <w:pStyle w:val="3"/>
@@ -1286,13 +1286,41 @@
         <w:tab/>
       </w:r>
       <w:r>
-        <w:t xml:space="preserve">Modify Matrix</w:t>
+        <w:t xml:space="preserve">Modify Style-Font</w:t>
       </w:r>
     </w:p>
     <w:p>
       <w:pPr>
         <w:pStyle w:val="FirstParagraph"/>
       </w:pPr>
+    </w:p>
+    <w:p>
+      <w:pPr>
+        <w:pStyle w:val="a0"/>
+      </w:pPr>
+      <w:r>
+        <w:rPr>
+          <w:b/>
+          <w:bCs/>
+        </w:rPr>
+        <w:t xml:space="preserve">Pandoc에서 사용하는 스타일 서식을 본인 스타일의 서식으로 변경</w:t>
+      </w:r>
+    </w:p>
+    <w:p>
+      <w:pPr>
+        <w:pStyle w:val="a8"/>
+      </w:pPr>
+      <w:r>
+        <w:t xml:space="preserve">중요사항</w:t>
+      </w:r>
+    </w:p>
+    <w:p>
+      <w:pPr>
+        <w:pStyle w:val="a8"/>
+      </w:pPr>
+      <w:r>
+        <w:t xml:space="preserve">아래의 스타일에서 폰트가 겹치면 안됨</w:t>
+      </w:r>
     </w:p>
     <w:p>
       <w:pPr>
@@ -1307,7 +1335,13 @@
           <w:b/>
           <w:bCs/>
         </w:rPr>
-        <w:t xml:space="preserve">테이블디자인 -&gt; 표스타일</w:t>
+        <w:t xml:space="preserve">스타일 수정-&gt;제목 2</w:t>
+      </w:r>
+      <w:r>
+        <w:br/>
+      </w:r>
+      <w:r>
+        <w:t xml:space="preserve">아래와 같이 폰트가 겹치는 경우가 발생</w:t>
       </w:r>
       <w:r>
         <w:br/>
@@ -1315,20 +1349,289 @@
       <w:r>
         <w:drawing>
           <wp:inline>
-            <wp:extent cx="5943600" cy="961352"/>
+            <wp:extent cx="5943600" cy="4723927"/>
             <wp:effectExtent b="0" l="0" r="0" t="0"/>
-            <wp:docPr descr="" title="" id="68" name="Picture"/>
+            <wp:docPr descr="" title="" id="69" name="Picture"/>
             <a:graphic>
               <a:graphicData uri="http://schemas.openxmlformats.org/drawingml/2006/picture">
                 <pic:pic>
                   <pic:nvPicPr>
-                    <pic:cNvPr descr="./imgs/pandoc_docx_04.png" id="69" name="Picture"/>
+                    <pic:cNvPr descr="./imgs/pandoc_docx_11.png" id="70" name="Picture"/>
                     <pic:cNvPicPr>
                       <a:picLocks noChangeArrowheads="1" noChangeAspect="1"/>
                     </pic:cNvPicPr>
                   </pic:nvPicPr>
                   <pic:blipFill>
-                    <a:blip r:embed="rId67"/>
+                    <a:blip r:embed="rId68"/>
+                    <a:stretch>
+                      <a:fillRect/>
+                    </a:stretch>
+                  </pic:blipFill>
+                  <pic:spPr bwMode="auto">
+                    <a:xfrm>
+                      <a:off x="0" y="0"/>
+                      <a:ext cx="5943600" cy="4723927"/>
+                    </a:xfrm>
+                    <a:prstGeom prst="rect">
+                      <a:avLst/>
+                    </a:prstGeom>
+                    <a:noFill/>
+                    <a:ln w="9525">
+                      <a:noFill/>
+                      <a:headEnd/>
+                      <a:tailEnd/>
+                    </a:ln>
+                  </pic:spPr>
+                </pic:pic>
+              </a:graphicData>
+            </a:graphic>
+          </wp:inline>
+        </w:drawing>
+      </w:r>
+    </w:p>
+    <w:p>
+      <w:pPr>
+        <w:pStyle w:val="Compact"/>
+        <w:numPr>
+          <w:ilvl w:val="1"/>
+          <w:numId w:val="1016"/>
+        </w:numPr>
+      </w:pPr>
+      <w:r>
+        <w:rPr>
+          <w:b/>
+          <w:bCs/>
+        </w:rPr>
+        <w:t xml:space="preserve">글꼴 -&gt; 원하는 글꼴 설정</w:t>
+      </w:r>
+      <w:r>
+        <w:t xml:space="preserve"> </w:t>
+      </w:r>
+      <w:r>
+        <w:drawing>
+          <wp:inline>
+            <wp:extent cx="4758709" cy="5821520"/>
+            <wp:effectExtent b="0" l="0" r="0" t="0"/>
+            <wp:docPr descr="" title="" id="72" name="Picture"/>
+            <a:graphic>
+              <a:graphicData uri="http://schemas.openxmlformats.org/drawingml/2006/picture">
+                <pic:pic>
+                  <pic:nvPicPr>
+                    <pic:cNvPr descr="./imgs/pandoc_docx_12.png" id="73" name="Picture"/>
+                    <pic:cNvPicPr>
+                      <a:picLocks noChangeArrowheads="1" noChangeAspect="1"/>
+                    </pic:cNvPicPr>
+                  </pic:nvPicPr>
+                  <pic:blipFill>
+                    <a:blip r:embed="rId71"/>
+                    <a:stretch>
+                      <a:fillRect/>
+                    </a:stretch>
+                  </pic:blipFill>
+                  <pic:spPr bwMode="auto">
+                    <a:xfrm>
+                      <a:off x="0" y="0"/>
+                      <a:ext cx="4758709" cy="5821520"/>
+                    </a:xfrm>
+                    <a:prstGeom prst="rect">
+                      <a:avLst/>
+                    </a:prstGeom>
+                    <a:noFill/>
+                    <a:ln w="9525">
+                      <a:noFill/>
+                      <a:headEnd/>
+                      <a:tailEnd/>
+                    </a:ln>
+                  </pic:spPr>
+                </pic:pic>
+              </a:graphicData>
+            </a:graphic>
+          </wp:inline>
+        </w:drawing>
+      </w:r>
+      <w:r>
+        <w:br/>
+      </w:r>
+    </w:p>
+    <w:p>
+      <w:pPr>
+        <w:pStyle w:val="Compact"/>
+        <w:numPr>
+          <w:ilvl w:val="1"/>
+          <w:numId w:val="1016"/>
+        </w:numPr>
+      </w:pPr>
+      <w:r>
+        <w:rPr>
+          <w:b/>
+          <w:bCs/>
+        </w:rPr>
+        <w:t xml:space="preserve">폰트 충돌 없음</w:t>
+      </w:r>
+      <w:r>
+        <w:t xml:space="preserve"> </w:t>
+      </w:r>
+      <w:r>
+        <w:drawing>
+          <wp:inline>
+            <wp:extent cx="5543849" cy="6204515"/>
+            <wp:effectExtent b="0" l="0" r="0" t="0"/>
+            <wp:docPr descr="" title="" id="75" name="Picture"/>
+            <a:graphic>
+              <a:graphicData uri="http://schemas.openxmlformats.org/drawingml/2006/picture">
+                <pic:pic>
+                  <pic:nvPicPr>
+                    <pic:cNvPr descr="./imgs/pandoc_docx_13.png" id="76" name="Picture"/>
+                    <pic:cNvPicPr>
+                      <a:picLocks noChangeArrowheads="1" noChangeAspect="1"/>
+                    </pic:cNvPicPr>
+                  </pic:nvPicPr>
+                  <pic:blipFill>
+                    <a:blip r:embed="rId74"/>
+                    <a:stretch>
+                      <a:fillRect/>
+                    </a:stretch>
+                  </pic:blipFill>
+                  <pic:spPr bwMode="auto">
+                    <a:xfrm>
+                      <a:off x="0" y="0"/>
+                      <a:ext cx="5543849" cy="6204515"/>
+                    </a:xfrm>
+                    <a:prstGeom prst="rect">
+                      <a:avLst/>
+                    </a:prstGeom>
+                    <a:noFill/>
+                    <a:ln w="9525">
+                      <a:noFill/>
+                      <a:headEnd/>
+                      <a:tailEnd/>
+                    </a:ln>
+                  </pic:spPr>
+                </pic:pic>
+              </a:graphicData>
+            </a:graphic>
+          </wp:inline>
+        </w:drawing>
+      </w:r>
+    </w:p>
+    <w:p>
+      <w:pPr>
+        <w:pStyle w:val="FirstParagraph"/>
+      </w:pPr>
+    </w:p>
+    <w:p>
+      <w:pPr>
+        <w:pStyle w:val="Compact"/>
+        <w:numPr>
+          <w:ilvl w:val="0"/>
+          <w:numId w:val="1017"/>
+        </w:numPr>
+      </w:pPr>
+      <w:r>
+        <w:rPr>
+          <w:b/>
+          <w:bCs/>
+        </w:rPr>
+        <w:t xml:space="preserve">TOC 문제</w:t>
+      </w:r>
+    </w:p>
+    <w:p>
+      <w:pPr>
+        <w:pStyle w:val="Compact"/>
+        <w:numPr>
+          <w:ilvl w:val="1"/>
+          <w:numId w:val="1018"/>
+        </w:numPr>
+      </w:pPr>
+      <w:r>
+        <w:t xml:space="preserve">제목 1 하이퍼링크</w:t>
+      </w:r>
+      <w:r>
+        <w:br/>
+      </w:r>
+    </w:p>
+    <w:p>
+      <w:pPr>
+        <w:pStyle w:val="Compact"/>
+        <w:numPr>
+          <w:ilvl w:val="1"/>
+          <w:numId w:val="1018"/>
+        </w:numPr>
+      </w:pPr>
+      <w:r>
+        <w:t xml:space="preserve">제목 2 하이퍼링크</w:t>
+      </w:r>
+      <w:r>
+        <w:br/>
+      </w:r>
+      <w:r>
+        <w:t xml:space="preserve">상위를 수정을 했다고 해서, TOC의 하이퍼링크도 개별로 적용해서 해야한다.</w:t>
+      </w:r>
+    </w:p>
+    <w:p>
+      <w:pPr>
+        <w:pStyle w:val="FirstParagraph"/>
+      </w:pPr>
+    </w:p>
+    <w:bookmarkEnd w:id="77"/>
+    <w:bookmarkStart w:id="96" w:name="modify-matrix"/>
+    <w:p>
+      <w:pPr>
+        <w:pStyle w:val="3"/>
+      </w:pPr>
+      <w:r>
+        <w:rPr>
+          <w:rStyle w:val="SectionNumber"/>
+        </w:rPr>
+        <w:t xml:space="preserve">3.5</w:t>
+      </w:r>
+      <w:r>
+        <w:tab/>
+      </w:r>
+      <w:r>
+        <w:t xml:space="preserve">Modify Matrix</w:t>
+      </w:r>
+    </w:p>
+    <w:p>
+      <w:pPr>
+        <w:pStyle w:val="FirstParagraph"/>
+      </w:pPr>
+    </w:p>
+    <w:p>
+      <w:pPr>
+        <w:pStyle w:val="Compact"/>
+        <w:numPr>
+          <w:ilvl w:val="0"/>
+          <w:numId w:val="1019"/>
+        </w:numPr>
+      </w:pPr>
+      <w:r>
+        <w:rPr>
+          <w:b/>
+          <w:bCs/>
+        </w:rPr>
+        <w:t xml:space="preserve">테이블디자인 -&gt; 표스타일</w:t>
+      </w:r>
+      <w:r>
+        <w:br/>
+      </w:r>
+      <w:r>
+        <w:drawing>
+          <wp:inline>
+            <wp:extent cx="5943600" cy="961352"/>
+            <wp:effectExtent b="0" l="0" r="0" t="0"/>
+            <wp:docPr descr="" title="" id="79" name="Picture"/>
+            <a:graphic>
+              <a:graphicData uri="http://schemas.openxmlformats.org/drawingml/2006/picture">
+                <pic:pic>
+                  <pic:nvPicPr>
+                    <pic:cNvPr descr="./imgs/pandoc_docx_04.png" id="80" name="Picture"/>
+                    <pic:cNvPicPr>
+                      <a:picLocks noChangeArrowheads="1" noChangeAspect="1"/>
+                    </pic:cNvPicPr>
+                  </pic:nvPicPr>
+                  <pic:blipFill>
+                    <a:blip r:embed="rId78"/>
                     <a:stretch>
                       <a:fillRect/>
                     </a:stretch>
@@ -1362,18 +1665,18 @@
           <wp:inline>
             <wp:extent cx="5419375" cy="8579082"/>
             <wp:effectExtent b="0" l="0" r="0" t="0"/>
-            <wp:docPr descr="" title="" id="71" name="Picture"/>
+            <wp:docPr descr="" title="" id="82" name="Picture"/>
             <a:graphic>
               <a:graphicData uri="http://schemas.openxmlformats.org/drawingml/2006/picture">
                 <pic:pic>
                   <pic:nvPicPr>
-                    <pic:cNvPr descr="./imgs/pandoc_docx_05.png" id="72" name="Picture"/>
+                    <pic:cNvPr descr="./imgs/pandoc_docx_05.png" id="83" name="Picture"/>
                     <pic:cNvPicPr>
                       <a:picLocks noChangeArrowheads="1" noChangeAspect="1"/>
                     </pic:cNvPicPr>
                   </pic:nvPicPr>
                   <pic:blipFill>
-                    <a:blip r:embed="rId70"/>
+                    <a:blip r:embed="rId81"/>
                     <a:stretch>
                       <a:fillRect/>
                     </a:stretch>
@@ -1418,7 +1721,7 @@
         <w:pStyle w:val="Compact"/>
         <w:numPr>
           <w:ilvl w:val="0"/>
-          <w:numId w:val="1016"/>
+          <w:numId w:val="1020"/>
         </w:numPr>
       </w:pPr>
       <w:r>
@@ -1434,7 +1737,7 @@
         <w:pStyle w:val="Compact"/>
         <w:numPr>
           <w:ilvl w:val="1"/>
-          <w:numId w:val="1017"/>
+          <w:numId w:val="1021"/>
         </w:numPr>
       </w:pPr>
       <w:r>
@@ -1459,7 +1762,7 @@
         <w:pStyle w:val="Compact"/>
         <w:numPr>
           <w:ilvl w:val="1"/>
-          <w:numId w:val="1017"/>
+          <w:numId w:val="1021"/>
         </w:numPr>
       </w:pPr>
       <w:r>
@@ -1481,7 +1784,7 @@
         <w:pStyle w:val="Compact"/>
         <w:numPr>
           <w:ilvl w:val="1"/>
-          <w:numId w:val="1017"/>
+          <w:numId w:val="1021"/>
         </w:numPr>
       </w:pPr>
       <w:r>
@@ -1495,18 +1798,18 @@
           <wp:inline>
             <wp:extent cx="5505549" cy="6175790"/>
             <wp:effectExtent b="0" l="0" r="0" t="0"/>
-            <wp:docPr descr="" title="" id="74" name="Picture"/>
+            <wp:docPr descr="" title="" id="85" name="Picture"/>
             <a:graphic>
               <a:graphicData uri="http://schemas.openxmlformats.org/drawingml/2006/picture">
                 <pic:pic>
                   <pic:nvPicPr>
-                    <pic:cNvPr descr="./imgs/pandoc_docx_06.png" id="75" name="Picture"/>
+                    <pic:cNvPr descr="./imgs/pandoc_docx_06.png" id="86" name="Picture"/>
                     <pic:cNvPicPr>
                       <a:picLocks noChangeArrowheads="1" noChangeAspect="1"/>
                     </pic:cNvPicPr>
                   </pic:nvPicPr>
                   <pic:blipFill>
-                    <a:blip r:embed="rId73"/>
+                    <a:blip r:embed="rId84"/>
                     <a:stretch>
                       <a:fillRect/>
                     </a:stretch>
@@ -1540,18 +1843,18 @@
           <wp:inline>
             <wp:extent cx="5562998" cy="6214090"/>
             <wp:effectExtent b="0" l="0" r="0" t="0"/>
-            <wp:docPr descr="" title="" id="77" name="Picture"/>
+            <wp:docPr descr="" title="" id="88" name="Picture"/>
             <a:graphic>
               <a:graphicData uri="http://schemas.openxmlformats.org/drawingml/2006/picture">
                 <pic:pic>
                   <pic:nvPicPr>
-                    <pic:cNvPr descr="./imgs/tool_pandoc_docx_02.png" id="78" name="Picture"/>
+                    <pic:cNvPr descr="./imgs/tool_pandoc_docx_02.png" id="89" name="Picture"/>
                     <pic:cNvPicPr>
                       <a:picLocks noChangeArrowheads="1" noChangeAspect="1"/>
                     </pic:cNvPicPr>
                   </pic:nvPicPr>
                   <pic:blipFill>
-                    <a:blip r:embed="rId76"/>
+                    <a:blip r:embed="rId87"/>
                     <a:stretch>
                       <a:fillRect/>
                     </a:stretch>
@@ -1585,18 +1888,18 @@
           <wp:inline>
             <wp:extent cx="5543849" cy="6156640"/>
             <wp:effectExtent b="0" l="0" r="0" t="0"/>
-            <wp:docPr descr="" title="" id="80" name="Picture"/>
+            <wp:docPr descr="" title="" id="91" name="Picture"/>
             <a:graphic>
               <a:graphicData uri="http://schemas.openxmlformats.org/drawingml/2006/picture">
                 <pic:pic>
                   <pic:nvPicPr>
-                    <pic:cNvPr descr="./imgs/tool_pandoc_docx_03.png" id="81" name="Picture"/>
+                    <pic:cNvPr descr="./imgs/tool_pandoc_docx_03.png" id="92" name="Picture"/>
                     <pic:cNvPicPr>
                       <a:picLocks noChangeArrowheads="1" noChangeAspect="1"/>
                     </pic:cNvPicPr>
                   </pic:nvPicPr>
                   <pic:blipFill>
-                    <a:blip r:embed="rId79"/>
+                    <a:blip r:embed="rId90"/>
                     <a:stretch>
                       <a:fillRect/>
                     </a:stretch>
@@ -1633,7 +1936,7 @@
         <w:pStyle w:val="Compact"/>
         <w:numPr>
           <w:ilvl w:val="0"/>
-          <w:numId w:val="1018"/>
+          <w:numId w:val="1022"/>
         </w:numPr>
       </w:pPr>
       <w:r>
@@ -1649,7 +1952,7 @@
         <w:pStyle w:val="Compact"/>
         <w:numPr>
           <w:ilvl w:val="1"/>
-          <w:numId w:val="1019"/>
+          <w:numId w:val="1023"/>
         </w:numPr>
       </w:pPr>
       <w:r>
@@ -1665,7 +1968,7 @@
         <w:pStyle w:val="Compact"/>
         <w:numPr>
           <w:ilvl w:val="1"/>
-          <w:numId w:val="1019"/>
+          <w:numId w:val="1023"/>
         </w:numPr>
       </w:pPr>
       <w:r>
@@ -1680,7 +1983,7 @@
         <w:pStyle w:val="Compact"/>
         <w:numPr>
           <w:ilvl w:val="1"/>
-          <w:numId w:val="1019"/>
+          <w:numId w:val="1023"/>
         </w:numPr>
       </w:pPr>
       <w:r>
@@ -1694,18 +1997,18 @@
           <wp:inline>
             <wp:extent cx="5543849" cy="6185365"/>
             <wp:effectExtent b="0" l="0" r="0" t="0"/>
-            <wp:docPr descr="" title="" id="83" name="Picture"/>
+            <wp:docPr descr="" title="" id="94" name="Picture"/>
             <a:graphic>
               <a:graphicData uri="http://schemas.openxmlformats.org/drawingml/2006/picture">
                 <pic:pic>
                   <pic:nvPicPr>
-                    <pic:cNvPr descr="./imgs/pandoc_docx_07.png" id="84" name="Picture"/>
+                    <pic:cNvPr descr="./imgs/pandoc_docx_07.png" id="95" name="Picture"/>
                     <pic:cNvPicPr>
                       <a:picLocks noChangeArrowheads="1" noChangeAspect="1"/>
                     </pic:cNvPicPr>
                   </pic:nvPicPr>
                   <pic:blipFill>
-                    <a:blip r:embed="rId82"/>
+                    <a:blip r:embed="rId93"/>
                     <a:stretch>
                       <a:fillRect/>
                     </a:stretch>
@@ -1935,8 +2238,8 @@
         <w:pStyle w:val="a0"/>
       </w:pPr>
     </w:p>
-    <w:bookmarkEnd w:id="85"/>
-    <w:bookmarkStart w:id="92" w:name="modify-toc"/>
+    <w:bookmarkEnd w:id="96"/>
+    <w:bookmarkStart w:id="112" w:name="modify-toc"/>
     <w:p>
       <w:pPr>
         <w:pStyle w:val="3"/>
@@ -1945,7 +2248,7 @@
         <w:rPr>
           <w:rStyle w:val="SectionNumber"/>
         </w:rPr>
-        <w:t xml:space="preserve">3.5</w:t>
+        <w:t xml:space="preserve">3.6</w:t>
       </w:r>
       <w:r>
         <w:tab/>
@@ -1964,7 +2267,7 @@
         <w:pStyle w:val="Compact"/>
         <w:numPr>
           <w:ilvl w:val="0"/>
-          <w:numId w:val="1020"/>
+          <w:numId w:val="1024"/>
         </w:numPr>
       </w:pPr>
       <w:r>
@@ -1980,7 +2283,7 @@
         <w:pStyle w:val="Compact"/>
         <w:numPr>
           <w:ilvl w:val="1"/>
-          <w:numId w:val="1021"/>
+          <w:numId w:val="1025"/>
         </w:numPr>
       </w:pPr>
       <w:r>
@@ -1995,7 +2298,7 @@
         <w:pStyle w:val="Compact"/>
         <w:numPr>
           <w:ilvl w:val="1"/>
-          <w:numId w:val="1021"/>
+          <w:numId w:val="1025"/>
         </w:numPr>
       </w:pPr>
       <w:r>
@@ -2009,18 +2312,18 @@
           <wp:inline>
             <wp:extent cx="5943600" cy="3815983"/>
             <wp:effectExtent b="0" l="0" r="0" t="0"/>
-            <wp:docPr descr="" title="" id="87" name="Picture"/>
+            <wp:docPr descr="" title="" id="98" name="Picture"/>
             <a:graphic>
               <a:graphicData uri="http://schemas.openxmlformats.org/drawingml/2006/picture">
                 <pic:pic>
                   <pic:nvPicPr>
-                    <pic:cNvPr descr="./imgs/pandoc_docx_08.png" id="88" name="Picture"/>
+                    <pic:cNvPr descr="./imgs/pandoc_docx_08.png" id="99" name="Picture"/>
                     <pic:cNvPicPr>
                       <a:picLocks noChangeArrowheads="1" noChangeAspect="1"/>
                     </pic:cNvPicPr>
                   </pic:nvPicPr>
                   <pic:blipFill>
-                    <a:blip r:embed="rId86"/>
+                    <a:blip r:embed="rId97"/>
                     <a:stretch>
                       <a:fillRect/>
                     </a:stretch>
@@ -2049,10 +2352,15 @@
     </w:p>
     <w:p>
       <w:pPr>
+        <w:pStyle w:val="FirstParagraph"/>
+      </w:pPr>
+    </w:p>
+    <w:p>
+      <w:pPr>
         <w:pStyle w:val="Compact"/>
         <w:numPr>
           <w:ilvl w:val="0"/>
-          <w:numId w:val="1020"/>
+          <w:numId w:val="1026"/>
         </w:numPr>
       </w:pPr>
       <w:r>
@@ -2068,28 +2376,26 @@
       <w:r>
         <w:t xml:space="preserve">Table of Contents 수정</w:t>
       </w:r>
-    </w:p>
-    <w:p>
-      <w:pPr>
-        <w:pStyle w:val="FirstParagraph"/>
-      </w:pPr>
+      <w:r>
+        <w:t xml:space="preserve"> </w:t>
+      </w:r>
       <w:r>
         <w:drawing>
           <wp:inline>
             <wp:extent cx="5943600" cy="4485177"/>
             <wp:effectExtent b="0" l="0" r="0" t="0"/>
-            <wp:docPr descr="" title="" id="90" name="Picture"/>
+            <wp:docPr descr="" title="" id="101" name="Picture"/>
             <a:graphic>
               <a:graphicData uri="http://schemas.openxmlformats.org/drawingml/2006/picture">
                 <pic:pic>
                   <pic:nvPicPr>
-                    <pic:cNvPr descr="./imgs/pandoc_docx_09.png" id="91" name="Picture"/>
+                    <pic:cNvPr descr="./imgs/pandoc_docx_09.png" id="102" name="Picture"/>
                     <pic:cNvPicPr>
                       <a:picLocks noChangeArrowheads="1" noChangeAspect="1"/>
                     </pic:cNvPicPr>
                   </pic:nvPicPr>
                   <pic:blipFill>
-                    <a:blip r:embed="rId89"/>
+                    <a:blip r:embed="rId100"/>
                     <a:stretch>
                       <a:fillRect/>
                     </a:stretch>
@@ -2118,483 +2424,6 @@
     </w:p>
     <w:p>
       <w:pPr>
-        <w:pStyle w:val="a0"/>
-      </w:pPr>
-    </w:p>
-    <w:bookmarkEnd w:id="92"/>
-    <w:bookmarkEnd w:id="93"/>
-    <w:bookmarkStart w:id="95" w:name="check-docxpptx"/>
-    <w:p>
-      <w:pPr>
-        <w:pStyle w:val="2"/>
-      </w:pPr>
-      <w:r>
-        <w:rPr>
-          <w:rStyle w:val="SectionNumber"/>
-        </w:rPr>
-        <w:t xml:space="preserve">4</w:t>
-      </w:r>
-      <w:r>
-        <w:tab/>
-      </w:r>
-      <w:r>
-        <w:t xml:space="preserve">Check DOCX/PPTX</w:t>
-      </w:r>
-    </w:p>
-    <w:p>
-      <w:pPr>
-        <w:pStyle w:val="FirstParagraph"/>
-      </w:pPr>
-    </w:p>
-    <w:p>
-      <w:pPr>
-        <w:pStyle w:val="Compact"/>
-        <w:numPr>
-          <w:ilvl w:val="0"/>
-          <w:numId w:val="1022"/>
-        </w:numPr>
-      </w:pPr>
-      <w:r>
-        <w:rPr>
-          <w:b/>
-          <w:bCs/>
-        </w:rPr>
-        <w:t xml:space="preserve">DOCX/PPTX 의 구성</w:t>
-      </w:r>
-      <w:r>
-        <w:br/>
-      </w:r>
-      <w:r>
-        <w:t xml:space="preserve">zip으로 되어있으며, 이를 풀면 XML 기반으로 쉽게 확인가능</w:t>
-      </w:r>
-    </w:p>
-    <w:p>
-      <w:pPr>
-        <w:pStyle w:val="SourceCode"/>
-      </w:pPr>
-      <w:r>
-        <w:rPr>
-          <w:rStyle w:val="VerbatimChar"/>
-        </w:rPr>
-        <w:t xml:space="preserve">tar -tf .\reference.docx | Select-Object -First 10</w:t>
-      </w:r>
-    </w:p>
-    <w:p>
-      <w:pPr>
-        <w:pStyle w:val="SourceCode"/>
-      </w:pPr>
-      <w:r>
-        <w:rPr>
-          <w:rStyle w:val="VerbatimChar"/>
-        </w:rPr>
-        <w:t xml:space="preserve">tar -tf .\reference.docx </w:t>
-      </w:r>
-    </w:p>
-    <w:p>
-      <w:pPr>
-        <w:pStyle w:val="SourceCode"/>
-      </w:pPr>
-      <w:r>
-        <w:rPr>
-          <w:rStyle w:val="VerbatimChar"/>
-        </w:rPr>
-        <w:t xml:space="preserve">[Content_Types].xml</w:t>
-      </w:r>
-      <w:r>
-        <w:br/>
-      </w:r>
-      <w:r>
-        <w:rPr>
-          <w:rStyle w:val="VerbatimChar"/>
-        </w:rPr>
-        <w:t xml:space="preserve">_rels/.rels</w:t>
-      </w:r>
-      <w:r>
-        <w:br/>
-      </w:r>
-      <w:r>
-        <w:rPr>
-          <w:rStyle w:val="VerbatimChar"/>
-        </w:rPr>
-        <w:t xml:space="preserve">docProps/app.xml</w:t>
-      </w:r>
-      <w:r>
-        <w:br/>
-      </w:r>
-      <w:r>
-        <w:rPr>
-          <w:rStyle w:val="VerbatimChar"/>
-        </w:rPr>
-        <w:t xml:space="preserve">docProps/core.xml</w:t>
-      </w:r>
-      <w:r>
-        <w:br/>
-      </w:r>
-      <w:r>
-        <w:rPr>
-          <w:rStyle w:val="VerbatimChar"/>
-        </w:rPr>
-        <w:t xml:space="preserve">docProps/custom.xml</w:t>
-      </w:r>
-      <w:r>
-        <w:br/>
-      </w:r>
-      <w:r>
-        <w:rPr>
-          <w:rStyle w:val="VerbatimChar"/>
-        </w:rPr>
-        <w:t xml:space="preserve">word/document.xml</w:t>
-      </w:r>
-      <w:r>
-        <w:br/>
-      </w:r>
-      <w:r>
-        <w:rPr>
-          <w:rStyle w:val="VerbatimChar"/>
-        </w:rPr>
-        <w:t xml:space="preserve">word/fontTable.xml</w:t>
-      </w:r>
-      <w:r>
-        <w:br/>
-      </w:r>
-      <w:r>
-        <w:rPr>
-          <w:rStyle w:val="VerbatimChar"/>
-        </w:rPr>
-        <w:t xml:space="preserve">word/footnotes.xml</w:t>
-      </w:r>
-      <w:r>
-        <w:br/>
-      </w:r>
-      <w:r>
-        <w:rPr>
-          <w:rStyle w:val="VerbatimChar"/>
-        </w:rPr>
-        <w:t xml:space="preserve">word/comments.xml</w:t>
-      </w:r>
-      <w:r>
-        <w:br/>
-      </w:r>
-      <w:r>
-        <w:rPr>
-          <w:rStyle w:val="VerbatimChar"/>
-        </w:rPr>
-        <w:t xml:space="preserve">word/numbering.xml</w:t>
-      </w:r>
-    </w:p>
-    <w:p>
-      <w:pPr>
-        <w:pStyle w:val="FirstParagraph"/>
-      </w:pPr>
-      <w:r>
-        <w:t xml:space="preserve"> </w:t>
-      </w:r>
-    </w:p>
-    <w:bookmarkStart w:id="94" w:name="check-xml"/>
-    <w:p>
-      <w:pPr>
-        <w:pStyle w:val="3"/>
-      </w:pPr>
-      <w:r>
-        <w:rPr>
-          <w:rStyle w:val="SectionNumber"/>
-        </w:rPr>
-        <w:t xml:space="preserve">4.1</w:t>
-      </w:r>
-      <w:r>
-        <w:tab/>
-      </w:r>
-      <w:r>
-        <w:t xml:space="preserve">Check XML</w:t>
-      </w:r>
-    </w:p>
-    <w:p>
-      <w:pPr>
-        <w:pStyle w:val="FirstParagraph"/>
-      </w:pPr>
-    </w:p>
-    <w:p>
-      <w:pPr>
-        <w:pStyle w:val="a0"/>
-      </w:pPr>
-      <w:r>
-        <w:rPr>
-          <w:b/>
-          <w:bCs/>
-        </w:rPr>
-        <w:t xml:space="preserve">XML기반으로 세부분석</w:t>
-      </w:r>
-    </w:p>
-    <w:p>
-      <w:pPr>
-        <w:pStyle w:val="Compact"/>
-        <w:numPr>
-          <w:ilvl w:val="0"/>
-          <w:numId w:val="1023"/>
-        </w:numPr>
-      </w:pPr>
-      <w:r>
-        <w:t xml:space="preserve">styles.xml 내용확인</w:t>
-      </w:r>
-    </w:p>
-    <w:p>
-      <w:pPr>
-        <w:pStyle w:val="SourceCode"/>
-      </w:pPr>
-      <w:r>
-        <w:rPr>
-          <w:rStyle w:val="VerbatimChar"/>
-        </w:rPr>
-        <w:t xml:space="preserve">tar -xf .\reference.docx -O word/styles.xml</w:t>
-      </w:r>
-    </w:p>
-    <w:p>
-      <w:pPr>
-        <w:pStyle w:val="FirstParagraph"/>
-      </w:pPr>
-    </w:p>
-    <w:p>
-      <w:pPr>
-        <w:pStyle w:val="Compact"/>
-        <w:numPr>
-          <w:ilvl w:val="0"/>
-          <w:numId w:val="1024"/>
-        </w:numPr>
-      </w:pPr>
-      <w:r>
-        <w:t xml:space="preserve">압축풀기</w:t>
-      </w:r>
-      <w:r>
-        <w:br/>
-      </w:r>
-      <w:r>
-        <w:t xml:space="preserve">압축을 풀면 다양한 XML과 Directory가 나옴</w:t>
-      </w:r>
-    </w:p>
-    <w:p>
-      <w:pPr>
-        <w:pStyle w:val="SourceCode"/>
-      </w:pPr>
-      <w:r>
-        <w:rPr>
-          <w:rStyle w:val="VerbatimChar"/>
-        </w:rPr>
-        <w:t xml:space="preserve">tar -xf .\reference.docx </w:t>
-      </w:r>
-    </w:p>
-    <w:p>
-      <w:pPr>
-        <w:pStyle w:val="FirstParagraph"/>
-      </w:pPr>
-    </w:p>
-    <w:p>
-      <w:r>
-        <w:pict>
-          <v:rect style="width:0;height:1.5pt" o:hralign="center" o:hrstd="t" o:hr="t"/>
-        </w:pict>
-      </w:r>
-    </w:p>
-    <w:bookmarkEnd w:id="94"/>
-    <w:bookmarkEnd w:id="95"/>
-    <w:bookmarkStart w:id="98" w:name="pandoc-build"/>
-    <w:p>
-      <w:pPr>
-        <w:pStyle w:val="2"/>
-      </w:pPr>
-      <w:r>
-        <w:rPr>
-          <w:rStyle w:val="SectionNumber"/>
-        </w:rPr>
-        <w:t xml:space="preserve">5</w:t>
-      </w:r>
-      <w:r>
-        <w:tab/>
-      </w:r>
-      <w:r>
-        <w:t xml:space="preserve">Pandoc Build</w:t>
-      </w:r>
-    </w:p>
-    <w:bookmarkStart w:id="96" w:name="convert-to-pptx"/>
-    <w:p>
-      <w:pPr>
-        <w:pStyle w:val="3"/>
-      </w:pPr>
-      <w:r>
-        <w:rPr>
-          <w:rStyle w:val="SectionNumber"/>
-        </w:rPr>
-        <w:t xml:space="preserve">5.1</w:t>
-      </w:r>
-      <w:r>
-        <w:tab/>
-      </w:r>
-      <w:r>
-        <w:t xml:space="preserve">Convert to PPTX</w:t>
-      </w:r>
-    </w:p>
-    <w:p>
-      <w:pPr>
-        <w:pStyle w:val="FirstParagraph"/>
-      </w:pPr>
-    </w:p>
-    <w:p>
-      <w:pPr>
-        <w:pStyle w:val="Compact"/>
-        <w:numPr>
-          <w:ilvl w:val="0"/>
-          <w:numId w:val="1025"/>
-        </w:numPr>
-      </w:pPr>
-      <w:r>
-        <w:t xml:space="preserve">Convert markdown to pptx</w:t>
-      </w:r>
-      <w:r>
-        <w:br/>
-      </w:r>
-      <w:r>
-        <w:t xml:space="preserve">간단히 변경가능하지만, 사용의미가 없음</w:t>
-      </w:r>
-      <w:r>
-        <w:br/>
-      </w:r>
-    </w:p>
-    <w:p>
-      <w:pPr>
-        <w:pStyle w:val="SourceCode"/>
-      </w:pPr>
-      <w:r>
-        <w:rPr>
-          <w:rStyle w:val="VerbatimChar"/>
-        </w:rPr>
-        <w:t xml:space="preserve">pandoc .\docs\index.md `</w:t>
-      </w:r>
-      <w:r>
-        <w:br/>
-      </w:r>
-      <w:r>
-        <w:rPr>
-          <w:rStyle w:val="VerbatimChar"/>
-        </w:rPr>
-        <w:t xml:space="preserve">  --slide-level=2 `</w:t>
-      </w:r>
-      <w:r>
-        <w:br/>
-      </w:r>
-      <w:r>
-        <w:rPr>
-          <w:rStyle w:val="VerbatimChar"/>
-        </w:rPr>
-        <w:t xml:space="preserve">  --resource-path=".;.\docs" `</w:t>
-      </w:r>
-      <w:r>
-        <w:br/>
-      </w:r>
-      <w:r>
-        <w:rPr>
-          <w:rStyle w:val="VerbatimChar"/>
-        </w:rPr>
-        <w:t xml:space="preserve">  -o .\output\index.pptx</w:t>
-      </w:r>
-    </w:p>
-    <w:p>
-      <w:pPr>
-        <w:pStyle w:val="FirstParagraph"/>
-      </w:pPr>
-    </w:p>
-    <w:p>
-      <w:pPr>
-        <w:pStyle w:val="Compact"/>
-        <w:numPr>
-          <w:ilvl w:val="0"/>
-          <w:numId w:val="1026"/>
-        </w:numPr>
-      </w:pPr>
-      <w:r>
-        <w:t xml:space="preserve">Convert markdown to pptx</w:t>
-      </w:r>
-      <w:r>
-        <w:br/>
-      </w:r>
-      <w:r>
-        <w:t xml:space="preserve">Reference 이용</w:t>
-      </w:r>
-      <w:r>
-        <w:br/>
-      </w:r>
-    </w:p>
-    <w:p>
-      <w:pPr>
-        <w:pStyle w:val="SourceCode"/>
-      </w:pPr>
-      <w:r>
-        <w:rPr>
-          <w:rStyle w:val="VerbatimChar"/>
-        </w:rPr>
-        <w:t xml:space="preserve">pandoc .\docs\index.md `</w:t>
-      </w:r>
-      <w:r>
-        <w:br/>
-      </w:r>
-      <w:r>
-        <w:rPr>
-          <w:rStyle w:val="VerbatimChar"/>
-        </w:rPr>
-        <w:t xml:space="preserve">  --slide-level=2 `</w:t>
-      </w:r>
-      <w:r>
-        <w:br/>
-      </w:r>
-      <w:r>
-        <w:rPr>
-          <w:rStyle w:val="VerbatimChar"/>
-        </w:rPr>
-        <w:t xml:space="preserve">  --reference-doc=.\docx\reference.pptx `</w:t>
-      </w:r>
-      <w:r>
-        <w:br/>
-      </w:r>
-      <w:r>
-        <w:rPr>
-          <w:rStyle w:val="VerbatimChar"/>
-        </w:rPr>
-        <w:t xml:space="preserve">  --resource-path=".;.\docs" `</w:t>
-      </w:r>
-      <w:r>
-        <w:br/>
-      </w:r>
-      <w:r>
-        <w:rPr>
-          <w:rStyle w:val="VerbatimChar"/>
-        </w:rPr>
-        <w:t xml:space="preserve">  -o .\output\index.pptx</w:t>
-      </w:r>
-    </w:p>
-    <w:p>
-      <w:pPr>
-        <w:pStyle w:val="FirstParagraph"/>
-      </w:pPr>
-    </w:p>
-    <w:bookmarkEnd w:id="96"/>
-    <w:bookmarkStart w:id="97" w:name="convert-to-docx"/>
-    <w:p>
-      <w:pPr>
-        <w:pStyle w:val="3"/>
-      </w:pPr>
-      <w:r>
-        <w:rPr>
-          <w:rStyle w:val="SectionNumber"/>
-        </w:rPr>
-        <w:t xml:space="preserve">5.2</w:t>
-      </w:r>
-      <w:r>
-        <w:tab/>
-      </w:r>
-      <w:r>
-        <w:t xml:space="preserve">Convert to DOCX</w:t>
-      </w:r>
-    </w:p>
-    <w:p>
-      <w:pPr>
         <w:pStyle w:val="FirstParagraph"/>
       </w:pPr>
     </w:p>
@@ -2607,72 +2436,99 @@
         </w:numPr>
       </w:pPr>
       <w:r>
-        <w:t xml:space="preserve">Convert markdown to docx</w:t>
-      </w:r>
-    </w:p>
-    <w:p>
-      <w:pPr>
-        <w:pStyle w:val="SourceCode"/>
-      </w:pPr>
-      <w:r>
-        <w:rPr>
-          <w:rStyle w:val="VerbatimChar"/>
-        </w:rPr>
-        <w:t xml:space="preserve">pandoc `</w:t>
-      </w:r>
-      <w:r>
-        <w:br/>
-      </w:r>
-      <w:r>
-        <w:rPr>
-          <w:rStyle w:val="VerbatimChar"/>
-        </w:rPr>
-        <w:t xml:space="preserve">  .\docs\index.md `</w:t>
-      </w:r>
-      <w:r>
-        <w:br/>
-      </w:r>
-      <w:r>
-        <w:rPr>
-          <w:rStyle w:val="VerbatimChar"/>
-        </w:rPr>
-        <w:t xml:space="preserve">  --toc `</w:t>
-      </w:r>
-      <w:r>
-        <w:br/>
-      </w:r>
-      <w:r>
-        <w:rPr>
-          <w:rStyle w:val="VerbatimChar"/>
-        </w:rPr>
-        <w:t xml:space="preserve">  --number-sections `</w:t>
-      </w:r>
-      <w:r>
-        <w:br/>
-      </w:r>
-      <w:r>
-        <w:rPr>
-          <w:rStyle w:val="VerbatimChar"/>
-        </w:rPr>
-        <w:t xml:space="preserve">  --reference-doc=.\docx\reference.docx `</w:t>
-      </w:r>
-      <w:r>
-        <w:br/>
-      </w:r>
-      <w:r>
-        <w:rPr>
-          <w:rStyle w:val="VerbatimChar"/>
-        </w:rPr>
-        <w:t xml:space="preserve">  --resource-path=".;.\docs" `</w:t>
-      </w:r>
-      <w:r>
-        <w:br/>
-      </w:r>
-      <w:r>
-        <w:rPr>
-          <w:rStyle w:val="VerbatimChar"/>
-        </w:rPr>
-        <w:t xml:space="preserve">  -o .\output\index.docx</w:t>
+        <w:rPr>
+          <w:b/>
+          <w:bCs/>
+        </w:rPr>
+        <w:t xml:space="preserve">하이퍼링크</w:t>
+      </w:r>
+      <w:r>
+        <w:br/>
+      </w:r>
+      <w:r>
+        <w:t xml:space="preserve">각 항목은 각 제목의 하이퍼 링크로 되어있어, 각 제목의 폰트를 그대로 적용되어진다.</w:t>
+      </w:r>
+      <w:r>
+        <w:t xml:space="preserve"> </w:t>
+      </w:r>
+      <w:r>
+        <w:rPr>
+          <w:b/>
+          <w:bCs/>
+        </w:rPr>
+        <w:t xml:space="preserve">같은 하이퍼 링크지만, 각 제목 1,2에 따라 다 확인</w:t>
+      </w:r>
+    </w:p>
+    <w:p>
+      <w:pPr>
+        <w:pStyle w:val="Compact"/>
+        <w:numPr>
+          <w:ilvl w:val="1"/>
+          <w:numId w:val="1028"/>
+        </w:numPr>
+      </w:pPr>
+      <w:r>
+        <w:t xml:space="preserve">제목 1 -&gt; 하이퍼 링크</w:t>
+      </w:r>
+      <w:r>
+        <w:br/>
+      </w:r>
+    </w:p>
+    <w:p>
+      <w:pPr>
+        <w:pStyle w:val="Compact"/>
+        <w:numPr>
+          <w:ilvl w:val="1"/>
+          <w:numId w:val="1028"/>
+        </w:numPr>
+      </w:pPr>
+      <w:r>
+        <w:t xml:space="preserve">제목 2 -&gt; 하이퍼 링크</w:t>
+      </w:r>
+      <w:r>
+        <w:t xml:space="preserve"> </w:t>
+      </w:r>
+      <w:r>
+        <w:drawing>
+          <wp:inline>
+            <wp:extent cx="5943600" cy="3630021"/>
+            <wp:effectExtent b="0" l="0" r="0" t="0"/>
+            <wp:docPr descr="" title="" id="104" name="Picture"/>
+            <a:graphic>
+              <a:graphicData uri="http://schemas.openxmlformats.org/drawingml/2006/picture">
+                <pic:pic>
+                  <pic:nvPicPr>
+                    <pic:cNvPr descr="./imgs/pandoc_docx_14.png" id="105" name="Picture"/>
+                    <pic:cNvPicPr>
+                      <a:picLocks noChangeArrowheads="1" noChangeAspect="1"/>
+                    </pic:cNvPicPr>
+                  </pic:nvPicPr>
+                  <pic:blipFill>
+                    <a:blip r:embed="rId103"/>
+                    <a:stretch>
+                      <a:fillRect/>
+                    </a:stretch>
+                  </pic:blipFill>
+                  <pic:spPr bwMode="auto">
+                    <a:xfrm>
+                      <a:off x="0" y="0"/>
+                      <a:ext cx="5943600" cy="3630021"/>
+                    </a:xfrm>
+                    <a:prstGeom prst="rect">
+                      <a:avLst/>
+                    </a:prstGeom>
+                    <a:noFill/>
+                    <a:ln w="9525">
+                      <a:noFill/>
+                      <a:headEnd/>
+                      <a:tailEnd/>
+                    </a:ln>
+                  </pic:spPr>
+                </pic:pic>
+              </a:graphicData>
+            </a:graphic>
+          </wp:inline>
+        </w:drawing>
       </w:r>
     </w:p>
     <w:p>
@@ -2685,10 +2541,647 @@
         <w:pStyle w:val="Compact"/>
         <w:numPr>
           <w:ilvl w:val="0"/>
-          <w:numId w:val="1028"/>
+          <w:numId w:val="1029"/>
         </w:numPr>
       </w:pPr>
       <w:r>
+        <w:rPr>
+          <w:b/>
+          <w:bCs/>
+        </w:rPr>
+        <w:t xml:space="preserve">하이퍼링크-&gt;단락</w:t>
+      </w:r>
+      <w:r>
+        <w:br/>
+      </w:r>
+      <w:r>
+        <w:t xml:space="preserve">전체 하이퍼링크를 선택 후 단락을 선택하여 각 간격 조절</w:t>
+      </w:r>
+      <w:r>
+        <w:br/>
+      </w:r>
+      <w:r>
+        <w:drawing>
+          <wp:inline>
+            <wp:extent cx="5943600" cy="5484043"/>
+            <wp:effectExtent b="0" l="0" r="0" t="0"/>
+            <wp:docPr descr="" title="" id="107" name="Picture"/>
+            <a:graphic>
+              <a:graphicData uri="http://schemas.openxmlformats.org/drawingml/2006/picture">
+                <pic:pic>
+                  <pic:nvPicPr>
+                    <pic:cNvPr descr="./imgs/pandoc_docx_15.png" id="108" name="Picture"/>
+                    <pic:cNvPicPr>
+                      <a:picLocks noChangeArrowheads="1" noChangeAspect="1"/>
+                    </pic:cNvPicPr>
+                  </pic:nvPicPr>
+                  <pic:blipFill>
+                    <a:blip r:embed="rId106"/>
+                    <a:stretch>
+                      <a:fillRect/>
+                    </a:stretch>
+                  </pic:blipFill>
+                  <pic:spPr bwMode="auto">
+                    <a:xfrm>
+                      <a:off x="0" y="0"/>
+                      <a:ext cx="5943600" cy="5484043"/>
+                    </a:xfrm>
+                    <a:prstGeom prst="rect">
+                      <a:avLst/>
+                    </a:prstGeom>
+                    <a:noFill/>
+                    <a:ln w="9525">
+                      <a:noFill/>
+                      <a:headEnd/>
+                      <a:tailEnd/>
+                    </a:ln>
+                  </pic:spPr>
+                </pic:pic>
+              </a:graphicData>
+            </a:graphic>
+          </wp:inline>
+        </w:drawing>
+      </w:r>
+    </w:p>
+    <w:p>
+      <w:pPr>
+        <w:pStyle w:val="FirstParagraph"/>
+      </w:pPr>
+    </w:p>
+    <w:p>
+      <w:pPr>
+        <w:pStyle w:val="Compact"/>
+        <w:numPr>
+          <w:ilvl w:val="0"/>
+          <w:numId w:val="1030"/>
+        </w:numPr>
+      </w:pPr>
+      <w:r>
+        <w:rPr>
+          <w:b/>
+          <w:bCs/>
+        </w:rPr>
+        <w:t xml:space="preserve">목차업데이트</w:t>
+      </w:r>
+      <w:r>
+        <w:br/>
+      </w:r>
+      <w:r>
+        <w:t xml:space="preserve">각 폰트 변경을 재확인을 해야함. 즉 1개의</w:t>
+      </w:r>
+      <w:r>
+        <w:t xml:space="preserve"> </w:t>
+      </w:r>
+      <w:r>
+        <w:rPr>
+          <w:b/>
+          <w:bCs/>
+        </w:rPr>
+        <w:t xml:space="preserve">제목 1</w:t>
+      </w:r>
+      <w:r>
+        <w:t xml:space="preserve"> </w:t>
+      </w:r>
+      <w:r>
+        <w:t xml:space="preserve">스타일 수정을 했다고, 전체 제목 1의 스타일 변경되지 않는다.</w:t>
+      </w:r>
+      <w:r>
+        <w:t xml:space="preserve"> </w:t>
+      </w:r>
+      <w:r>
+        <w:drawing>
+          <wp:inline>
+            <wp:extent cx="5943600" cy="4273497"/>
+            <wp:effectExtent b="0" l="0" r="0" t="0"/>
+            <wp:docPr descr="" title="" id="110" name="Picture"/>
+            <a:graphic>
+              <a:graphicData uri="http://schemas.openxmlformats.org/drawingml/2006/picture">
+                <pic:pic>
+                  <pic:nvPicPr>
+                    <pic:cNvPr descr="./imgs/pandoc_docx_10.png" id="111" name="Picture"/>
+                    <pic:cNvPicPr>
+                      <a:picLocks noChangeArrowheads="1" noChangeAspect="1"/>
+                    </pic:cNvPicPr>
+                  </pic:nvPicPr>
+                  <pic:blipFill>
+                    <a:blip r:embed="rId109"/>
+                    <a:stretch>
+                      <a:fillRect/>
+                    </a:stretch>
+                  </pic:blipFill>
+                  <pic:spPr bwMode="auto">
+                    <a:xfrm>
+                      <a:off x="0" y="0"/>
+                      <a:ext cx="5943600" cy="4273497"/>
+                    </a:xfrm>
+                    <a:prstGeom prst="rect">
+                      <a:avLst/>
+                    </a:prstGeom>
+                    <a:noFill/>
+                    <a:ln w="9525">
+                      <a:noFill/>
+                      <a:headEnd/>
+                      <a:tailEnd/>
+                    </a:ln>
+                  </pic:spPr>
+                </pic:pic>
+              </a:graphicData>
+            </a:graphic>
+          </wp:inline>
+        </w:drawing>
+      </w:r>
+    </w:p>
+    <w:p>
+      <w:pPr>
+        <w:pStyle w:val="FirstParagraph"/>
+      </w:pPr>
+    </w:p>
+    <w:bookmarkEnd w:id="112"/>
+    <w:bookmarkEnd w:id="113"/>
+    <w:bookmarkStart w:id="115" w:name="check-docxpptx"/>
+    <w:p>
+      <w:pPr>
+        <w:pStyle w:val="2"/>
+      </w:pPr>
+      <w:r>
+        <w:rPr>
+          <w:rStyle w:val="SectionNumber"/>
+        </w:rPr>
+        <w:t xml:space="preserve">4</w:t>
+      </w:r>
+      <w:r>
+        <w:tab/>
+      </w:r>
+      <w:r>
+        <w:t xml:space="preserve">Check DOCX/PPTX</w:t>
+      </w:r>
+    </w:p>
+    <w:p>
+      <w:pPr>
+        <w:pStyle w:val="FirstParagraph"/>
+      </w:pPr>
+    </w:p>
+    <w:p>
+      <w:pPr>
+        <w:pStyle w:val="Compact"/>
+        <w:numPr>
+          <w:ilvl w:val="0"/>
+          <w:numId w:val="1031"/>
+        </w:numPr>
+      </w:pPr>
+      <w:r>
+        <w:rPr>
+          <w:b/>
+          <w:bCs/>
+        </w:rPr>
+        <w:t xml:space="preserve">DOCX/PPTX 의 구성</w:t>
+      </w:r>
+      <w:r>
+        <w:br/>
+      </w:r>
+      <w:r>
+        <w:t xml:space="preserve">zip으로 되어있으며, 이를 풀면 XML 기반으로 쉽게 확인가능</w:t>
+      </w:r>
+    </w:p>
+    <w:p>
+      <w:pPr>
+        <w:pStyle w:val="SourceCode"/>
+      </w:pPr>
+      <w:r>
+        <w:rPr>
+          <w:rStyle w:val="VerbatimChar"/>
+        </w:rPr>
+        <w:t xml:space="preserve">tar -tf .\reference.docx | Select-Object -First 10</w:t>
+      </w:r>
+    </w:p>
+    <w:p>
+      <w:pPr>
+        <w:pStyle w:val="SourceCode"/>
+      </w:pPr>
+      <w:r>
+        <w:rPr>
+          <w:rStyle w:val="VerbatimChar"/>
+        </w:rPr>
+        <w:t xml:space="preserve">tar -tf .\reference.docx </w:t>
+      </w:r>
+    </w:p>
+    <w:p>
+      <w:pPr>
+        <w:pStyle w:val="SourceCode"/>
+      </w:pPr>
+      <w:r>
+        <w:rPr>
+          <w:rStyle w:val="VerbatimChar"/>
+        </w:rPr>
+        <w:t xml:space="preserve">[Content_Types].xml</w:t>
+      </w:r>
+      <w:r>
+        <w:br/>
+      </w:r>
+      <w:r>
+        <w:rPr>
+          <w:rStyle w:val="VerbatimChar"/>
+        </w:rPr>
+        <w:t xml:space="preserve">_rels/.rels</w:t>
+      </w:r>
+      <w:r>
+        <w:br/>
+      </w:r>
+      <w:r>
+        <w:rPr>
+          <w:rStyle w:val="VerbatimChar"/>
+        </w:rPr>
+        <w:t xml:space="preserve">docProps/app.xml</w:t>
+      </w:r>
+      <w:r>
+        <w:br/>
+      </w:r>
+      <w:r>
+        <w:rPr>
+          <w:rStyle w:val="VerbatimChar"/>
+        </w:rPr>
+        <w:t xml:space="preserve">docProps/core.xml</w:t>
+      </w:r>
+      <w:r>
+        <w:br/>
+      </w:r>
+      <w:r>
+        <w:rPr>
+          <w:rStyle w:val="VerbatimChar"/>
+        </w:rPr>
+        <w:t xml:space="preserve">docProps/custom.xml</w:t>
+      </w:r>
+      <w:r>
+        <w:br/>
+      </w:r>
+      <w:r>
+        <w:rPr>
+          <w:rStyle w:val="VerbatimChar"/>
+        </w:rPr>
+        <w:t xml:space="preserve">word/document.xml</w:t>
+      </w:r>
+      <w:r>
+        <w:br/>
+      </w:r>
+      <w:r>
+        <w:rPr>
+          <w:rStyle w:val="VerbatimChar"/>
+        </w:rPr>
+        <w:t xml:space="preserve">word/fontTable.xml</w:t>
+      </w:r>
+      <w:r>
+        <w:br/>
+      </w:r>
+      <w:r>
+        <w:rPr>
+          <w:rStyle w:val="VerbatimChar"/>
+        </w:rPr>
+        <w:t xml:space="preserve">word/footnotes.xml</w:t>
+      </w:r>
+      <w:r>
+        <w:br/>
+      </w:r>
+      <w:r>
+        <w:rPr>
+          <w:rStyle w:val="VerbatimChar"/>
+        </w:rPr>
+        <w:t xml:space="preserve">word/comments.xml</w:t>
+      </w:r>
+      <w:r>
+        <w:br/>
+      </w:r>
+      <w:r>
+        <w:rPr>
+          <w:rStyle w:val="VerbatimChar"/>
+        </w:rPr>
+        <w:t xml:space="preserve">word/numbering.xml</w:t>
+      </w:r>
+    </w:p>
+    <w:p>
+      <w:pPr>
+        <w:pStyle w:val="FirstParagraph"/>
+      </w:pPr>
+      <w:r>
+        <w:t xml:space="preserve"> </w:t>
+      </w:r>
+    </w:p>
+    <w:bookmarkStart w:id="114" w:name="check-xml"/>
+    <w:p>
+      <w:pPr>
+        <w:pStyle w:val="3"/>
+      </w:pPr>
+      <w:r>
+        <w:rPr>
+          <w:rStyle w:val="SectionNumber"/>
+        </w:rPr>
+        <w:t xml:space="preserve">4.1</w:t>
+      </w:r>
+      <w:r>
+        <w:tab/>
+      </w:r>
+      <w:r>
+        <w:t xml:space="preserve">Check XML</w:t>
+      </w:r>
+    </w:p>
+    <w:p>
+      <w:pPr>
+        <w:pStyle w:val="FirstParagraph"/>
+      </w:pPr>
+    </w:p>
+    <w:p>
+      <w:pPr>
+        <w:pStyle w:val="a0"/>
+      </w:pPr>
+      <w:r>
+        <w:rPr>
+          <w:b/>
+          <w:bCs/>
+        </w:rPr>
+        <w:t xml:space="preserve">XML기반으로 세부분석</w:t>
+      </w:r>
+    </w:p>
+    <w:p>
+      <w:pPr>
+        <w:pStyle w:val="Compact"/>
+        <w:numPr>
+          <w:ilvl w:val="0"/>
+          <w:numId w:val="1032"/>
+        </w:numPr>
+      </w:pPr>
+      <w:r>
+        <w:t xml:space="preserve">styles.xml 내용확인</w:t>
+      </w:r>
+    </w:p>
+    <w:p>
+      <w:pPr>
+        <w:pStyle w:val="SourceCode"/>
+      </w:pPr>
+      <w:r>
+        <w:rPr>
+          <w:rStyle w:val="VerbatimChar"/>
+        </w:rPr>
+        <w:t xml:space="preserve">tar -xf .\reference.docx -O word/styles.xml</w:t>
+      </w:r>
+    </w:p>
+    <w:p>
+      <w:pPr>
+        <w:pStyle w:val="FirstParagraph"/>
+      </w:pPr>
+    </w:p>
+    <w:p>
+      <w:pPr>
+        <w:pStyle w:val="Compact"/>
+        <w:numPr>
+          <w:ilvl w:val="0"/>
+          <w:numId w:val="1033"/>
+        </w:numPr>
+      </w:pPr>
+      <w:r>
+        <w:t xml:space="preserve">압축풀기</w:t>
+      </w:r>
+      <w:r>
+        <w:br/>
+      </w:r>
+      <w:r>
+        <w:t xml:space="preserve">압축을 풀면 다양한 XML과 Directory가 나옴</w:t>
+      </w:r>
+    </w:p>
+    <w:p>
+      <w:pPr>
+        <w:pStyle w:val="SourceCode"/>
+      </w:pPr>
+      <w:r>
+        <w:rPr>
+          <w:rStyle w:val="VerbatimChar"/>
+        </w:rPr>
+        <w:t xml:space="preserve">tar -xf .\reference.docx </w:t>
+      </w:r>
+    </w:p>
+    <w:p>
+      <w:pPr>
+        <w:pStyle w:val="FirstParagraph"/>
+      </w:pPr>
+    </w:p>
+    <w:p>
+      <w:r>
+        <w:pict>
+          <v:rect style="width:0;height:1.5pt" o:hralign="center" o:hrstd="t" o:hr="t"/>
+        </w:pict>
+      </w:r>
+    </w:p>
+    <w:bookmarkEnd w:id="114"/>
+    <w:bookmarkEnd w:id="115"/>
+    <w:bookmarkStart w:id="118" w:name="pandoc-build"/>
+    <w:p>
+      <w:pPr>
+        <w:pStyle w:val="2"/>
+      </w:pPr>
+      <w:r>
+        <w:rPr>
+          <w:rStyle w:val="SectionNumber"/>
+        </w:rPr>
+        <w:t xml:space="preserve">5</w:t>
+      </w:r>
+      <w:r>
+        <w:tab/>
+      </w:r>
+      <w:r>
+        <w:t xml:space="preserve">Pandoc Build</w:t>
+      </w:r>
+    </w:p>
+    <w:bookmarkStart w:id="116" w:name="convert-to-pptx"/>
+    <w:p>
+      <w:pPr>
+        <w:pStyle w:val="3"/>
+      </w:pPr>
+      <w:r>
+        <w:rPr>
+          <w:rStyle w:val="SectionNumber"/>
+        </w:rPr>
+        <w:t xml:space="preserve">5.1</w:t>
+      </w:r>
+      <w:r>
+        <w:tab/>
+      </w:r>
+      <w:r>
+        <w:t xml:space="preserve">Convert to PPTX</w:t>
+      </w:r>
+    </w:p>
+    <w:p>
+      <w:pPr>
+        <w:pStyle w:val="FirstParagraph"/>
+      </w:pPr>
+    </w:p>
+    <w:p>
+      <w:pPr>
+        <w:pStyle w:val="Compact"/>
+        <w:numPr>
+          <w:ilvl w:val="0"/>
+          <w:numId w:val="1034"/>
+        </w:numPr>
+      </w:pPr>
+      <w:r>
+        <w:t xml:space="preserve">Convert markdown to pptx</w:t>
+      </w:r>
+      <w:r>
+        <w:br/>
+      </w:r>
+      <w:r>
+        <w:t xml:space="preserve">간단히 변경가능하지만, 사용의미가 없음</w:t>
+      </w:r>
+      <w:r>
+        <w:br/>
+      </w:r>
+    </w:p>
+    <w:p>
+      <w:pPr>
+        <w:pStyle w:val="SourceCode"/>
+      </w:pPr>
+      <w:r>
+        <w:rPr>
+          <w:rStyle w:val="VerbatimChar"/>
+        </w:rPr>
+        <w:t xml:space="preserve">pandoc .\docs\index.md `</w:t>
+      </w:r>
+      <w:r>
+        <w:br/>
+      </w:r>
+      <w:r>
+        <w:rPr>
+          <w:rStyle w:val="VerbatimChar"/>
+        </w:rPr>
+        <w:t xml:space="preserve">  --slide-level=2 `</w:t>
+      </w:r>
+      <w:r>
+        <w:br/>
+      </w:r>
+      <w:r>
+        <w:rPr>
+          <w:rStyle w:val="VerbatimChar"/>
+        </w:rPr>
+        <w:t xml:space="preserve">  --resource-path=".;.\docs" `</w:t>
+      </w:r>
+      <w:r>
+        <w:br/>
+      </w:r>
+      <w:r>
+        <w:rPr>
+          <w:rStyle w:val="VerbatimChar"/>
+        </w:rPr>
+        <w:t xml:space="preserve">  -o .\output\index.pptx</w:t>
+      </w:r>
+    </w:p>
+    <w:p>
+      <w:pPr>
+        <w:pStyle w:val="FirstParagraph"/>
+      </w:pPr>
+    </w:p>
+    <w:p>
+      <w:pPr>
+        <w:pStyle w:val="Compact"/>
+        <w:numPr>
+          <w:ilvl w:val="0"/>
+          <w:numId w:val="1035"/>
+        </w:numPr>
+      </w:pPr>
+      <w:r>
+        <w:t xml:space="preserve">Convert markdown to pptx</w:t>
+      </w:r>
+      <w:r>
+        <w:br/>
+      </w:r>
+      <w:r>
+        <w:t xml:space="preserve">Reference 이용</w:t>
+      </w:r>
+      <w:r>
+        <w:br/>
+      </w:r>
+    </w:p>
+    <w:p>
+      <w:pPr>
+        <w:pStyle w:val="SourceCode"/>
+      </w:pPr>
+      <w:r>
+        <w:rPr>
+          <w:rStyle w:val="VerbatimChar"/>
+        </w:rPr>
+        <w:t xml:space="preserve">pandoc .\docs\index.md `</w:t>
+      </w:r>
+      <w:r>
+        <w:br/>
+      </w:r>
+      <w:r>
+        <w:rPr>
+          <w:rStyle w:val="VerbatimChar"/>
+        </w:rPr>
+        <w:t xml:space="preserve">  --slide-level=2 `</w:t>
+      </w:r>
+      <w:r>
+        <w:br/>
+      </w:r>
+      <w:r>
+        <w:rPr>
+          <w:rStyle w:val="VerbatimChar"/>
+        </w:rPr>
+        <w:t xml:space="preserve">  --reference-doc=.\docx\reference.pptx `</w:t>
+      </w:r>
+      <w:r>
+        <w:br/>
+      </w:r>
+      <w:r>
+        <w:rPr>
+          <w:rStyle w:val="VerbatimChar"/>
+        </w:rPr>
+        <w:t xml:space="preserve">  --resource-path=".;.\docs" `</w:t>
+      </w:r>
+      <w:r>
+        <w:br/>
+      </w:r>
+      <w:r>
+        <w:rPr>
+          <w:rStyle w:val="VerbatimChar"/>
+        </w:rPr>
+        <w:t xml:space="preserve">  -o .\output\index.pptx</w:t>
+      </w:r>
+    </w:p>
+    <w:p>
+      <w:pPr>
+        <w:pStyle w:val="FirstParagraph"/>
+      </w:pPr>
+    </w:p>
+    <w:bookmarkEnd w:id="116"/>
+    <w:bookmarkStart w:id="117" w:name="convert-to-docx"/>
+    <w:p>
+      <w:pPr>
+        <w:pStyle w:val="3"/>
+      </w:pPr>
+      <w:r>
+        <w:rPr>
+          <w:rStyle w:val="SectionNumber"/>
+        </w:rPr>
+        <w:t xml:space="preserve">5.2</w:t>
+      </w:r>
+      <w:r>
+        <w:tab/>
+      </w:r>
+      <w:r>
+        <w:t xml:space="preserve">Convert to DOCX</w:t>
+      </w:r>
+    </w:p>
+    <w:p>
+      <w:pPr>
+        <w:pStyle w:val="FirstParagraph"/>
+      </w:pPr>
+    </w:p>
+    <w:p>
+      <w:pPr>
+        <w:pStyle w:val="Compact"/>
+        <w:numPr>
+          <w:ilvl w:val="0"/>
+          <w:numId w:val="1036"/>
+        </w:numPr>
+      </w:pPr>
+      <w:r>
         <w:t xml:space="preserve">Convert markdown to docx</w:t>
       </w:r>
     </w:p>
@@ -2709,6 +3202,88 @@
         <w:rPr>
           <w:rStyle w:val="VerbatimChar"/>
         </w:rPr>
+        <w:t xml:space="preserve">  .\docs\index.md `</w:t>
+      </w:r>
+      <w:r>
+        <w:br/>
+      </w:r>
+      <w:r>
+        <w:rPr>
+          <w:rStyle w:val="VerbatimChar"/>
+        </w:rPr>
+        <w:t xml:space="preserve">  --toc `</w:t>
+      </w:r>
+      <w:r>
+        <w:br/>
+      </w:r>
+      <w:r>
+        <w:rPr>
+          <w:rStyle w:val="VerbatimChar"/>
+        </w:rPr>
+        <w:t xml:space="preserve">  --number-sections `</w:t>
+      </w:r>
+      <w:r>
+        <w:br/>
+      </w:r>
+      <w:r>
+        <w:rPr>
+          <w:rStyle w:val="VerbatimChar"/>
+        </w:rPr>
+        <w:t xml:space="preserve">  --reference-doc=.\docx\reference.docx `</w:t>
+      </w:r>
+      <w:r>
+        <w:br/>
+      </w:r>
+      <w:r>
+        <w:rPr>
+          <w:rStyle w:val="VerbatimChar"/>
+        </w:rPr>
+        <w:t xml:space="preserve">  --resource-path=".;.\docs" `</w:t>
+      </w:r>
+      <w:r>
+        <w:br/>
+      </w:r>
+      <w:r>
+        <w:rPr>
+          <w:rStyle w:val="VerbatimChar"/>
+        </w:rPr>
+        <w:t xml:space="preserve">  -o .\output\index.docx</w:t>
+      </w:r>
+    </w:p>
+    <w:p>
+      <w:pPr>
+        <w:pStyle w:val="FirstParagraph"/>
+      </w:pPr>
+    </w:p>
+    <w:p>
+      <w:pPr>
+        <w:pStyle w:val="Compact"/>
+        <w:numPr>
+          <w:ilvl w:val="0"/>
+          <w:numId w:val="1037"/>
+        </w:numPr>
+      </w:pPr>
+      <w:r>
+        <w:t xml:space="preserve">Convert markdown to docx</w:t>
+      </w:r>
+    </w:p>
+    <w:p>
+      <w:pPr>
+        <w:pStyle w:val="SourceCode"/>
+      </w:pPr>
+      <w:r>
+        <w:rPr>
+          <w:rStyle w:val="VerbatimChar"/>
+        </w:rPr>
+        <w:t xml:space="preserve">pandoc `</w:t>
+      </w:r>
+      <w:r>
+        <w:br/>
+      </w:r>
+      <w:r>
+        <w:rPr>
+          <w:rStyle w:val="VerbatimChar"/>
+        </w:rPr>
         <w:t xml:space="preserve">  .\docs\tool_pandoc.md `</w:t>
       </w:r>
       <w:r>
@@ -2762,9 +3337,9 @@
         <w:pStyle w:val="FirstParagraph"/>
       </w:pPr>
     </w:p>
-    <w:bookmarkEnd w:id="97"/>
-    <w:bookmarkEnd w:id="98"/>
-    <w:bookmarkStart w:id="101" w:name="mermaid-build"/>
+    <w:bookmarkEnd w:id="117"/>
+    <w:bookmarkEnd w:id="118"/>
+    <w:bookmarkStart w:id="121" w:name="mermaid-build"/>
     <w:p>
       <w:pPr>
         <w:pStyle w:val="2"/>
@@ -2799,7 +3374,7 @@
       <w:pPr>
         <w:pStyle w:val="a0"/>
       </w:pPr>
-      <w:hyperlink r:id="rId99">
+      <w:hyperlink r:id="rId119">
         <w:r>
           <w:rPr>
             <w:rStyle w:val="ac"/>
@@ -2818,7 +3393,7 @@
         <w:pStyle w:val="Compact"/>
         <w:numPr>
           <w:ilvl w:val="0"/>
-          <w:numId w:val="1029"/>
+          <w:numId w:val="1038"/>
         </w:numPr>
       </w:pPr>
       <w:r>
@@ -2865,7 +3440,7 @@
         <w:pStyle w:val="Compact"/>
         <w:numPr>
           <w:ilvl w:val="0"/>
-          <w:numId w:val="1030"/>
+          <w:numId w:val="1039"/>
         </w:numPr>
       </w:pPr>
       <w:r>
@@ -2883,7 +3458,7 @@
         <w:pStyle w:val="FirstParagraph"/>
       </w:pPr>
     </w:p>
-    <w:bookmarkStart w:id="100" w:name="convert-mermaid-to-svg"/>
+    <w:bookmarkStart w:id="120" w:name="convert-mermaid-to-svg"/>
     <w:p>
       <w:pPr>
         <w:pStyle w:val="3"/>
@@ -2911,7 +3486,7 @@
         <w:pStyle w:val="Compact"/>
         <w:numPr>
           <w:ilvl w:val="0"/>
-          <w:numId w:val="1031"/>
+          <w:numId w:val="1040"/>
         </w:numPr>
       </w:pPr>
       <w:r>
@@ -3032,11 +3607,477 @@
         <w:t xml:space="preserve">  -b transparent</w:t>
       </w:r>
     </w:p>
-    <w:bookmarkEnd w:id="100"/>
-    <w:bookmarkEnd w:id="101"/>
+    <w:p>
+      <w:pPr>
+        <w:pStyle w:val="FirstParagraph"/>
+      </w:pPr>
+    </w:p>
+    <w:bookmarkEnd w:id="120"/>
+    <w:bookmarkEnd w:id="121"/>
+    <w:bookmarkStart w:id="125" w:name="lua-filter"/>
+    <w:p>
+      <w:pPr>
+        <w:pStyle w:val="2"/>
+      </w:pPr>
+      <w:r>
+        <w:rPr>
+          <w:rStyle w:val="SectionNumber"/>
+        </w:rPr>
+        <w:t xml:space="preserve">7</w:t>
+      </w:r>
+      <w:r>
+        <w:tab/>
+      </w:r>
+      <w:r>
+        <w:t xml:space="preserve">Lua Filter</w:t>
+      </w:r>
+    </w:p>
+    <w:p>
+      <w:pPr>
+        <w:pStyle w:val="FirstParagraph"/>
+      </w:pPr>
+    </w:p>
+    <w:p>
+      <w:pPr>
+        <w:pStyle w:val="Compact"/>
+        <w:numPr>
+          <w:ilvl w:val="0"/>
+          <w:numId w:val="1041"/>
+        </w:numPr>
+      </w:pPr>
+      <w:r>
+        <w:t xml:space="preserve">Check Pandoc Version and Lua Filter Engine</w:t>
+      </w:r>
+    </w:p>
+    <w:p>
+      <w:pPr>
+        <w:pStyle w:val="SourceCode"/>
+      </w:pPr>
+      <w:r>
+        <w:rPr>
+          <w:rStyle w:val="VerbatimChar"/>
+        </w:rPr>
+        <w:t xml:space="preserve">pandoc --version</w:t>
+      </w:r>
+      <w:r>
+        <w:br/>
+      </w:r>
+      <w:r>
+        <w:rPr>
+          <w:rStyle w:val="VerbatimChar"/>
+        </w:rPr>
+        <w:t xml:space="preserve">pandoc 3.10</w:t>
+      </w:r>
+      <w:r>
+        <w:br/>
+      </w:r>
+      <w:r>
+        <w:rPr>
+          <w:rStyle w:val="VerbatimChar"/>
+        </w:rPr>
+        <w:t xml:space="preserve">Features: +server +lua</w:t>
+      </w:r>
+      <w:r>
+        <w:br/>
+      </w:r>
+      <w:r>
+        <w:rPr>
+          <w:rStyle w:val="VerbatimChar"/>
+        </w:rPr>
+        <w:t xml:space="preserve">Scripting engine: Lua 5.4</w:t>
+      </w:r>
+      <w:r>
+        <w:br/>
+      </w:r>
+      <w:r>
+        <w:rPr>
+          <w:rStyle w:val="VerbatimChar"/>
+        </w:rPr>
+        <w:t xml:space="preserve">User data directory: C:\Users\LeeJeongHun\AppData\Roaming\pandoc</w:t>
+      </w:r>
+      <w:r>
+        <w:br/>
+      </w:r>
+      <w:r>
+        <w:rPr>
+          <w:rStyle w:val="VerbatimChar"/>
+        </w:rPr>
+        <w:t xml:space="preserve">Copyright (C) 2006-2025 John MacFarlane. Web:  https://pandoc.org</w:t>
+      </w:r>
+      <w:r>
+        <w:br/>
+      </w:r>
+      <w:r>
+        <w:rPr>
+          <w:rStyle w:val="VerbatimChar"/>
+        </w:rPr>
+        <w:t xml:space="preserve">This is free software; see the source for copying conditions. There is no</w:t>
+      </w:r>
+      <w:r>
+        <w:br/>
+      </w:r>
+      <w:r>
+        <w:rPr>
+          <w:rStyle w:val="VerbatimChar"/>
+        </w:rPr>
+        <w:t xml:space="preserve">warranty, not even for merchantability or fitness for a particular purpose.</w:t>
+      </w:r>
+    </w:p>
+    <w:p>
+      <w:pPr>
+        <w:pStyle w:val="FirstParagraph"/>
+      </w:pPr>
+    </w:p>
+    <w:p>
+      <w:pPr>
+        <w:pStyle w:val="Compact"/>
+        <w:numPr>
+          <w:ilvl w:val="0"/>
+          <w:numId w:val="1042"/>
+        </w:numPr>
+      </w:pPr>
+      <w:r>
+        <w:rPr>
+          <w:b/>
+          <w:bCs/>
+        </w:rPr>
+        <w:t xml:space="preserve">Markdown</w:t>
+      </w:r>
+      <w:r>
+        <w:br/>
+      </w:r>
+      <w:r>
+        <w:t xml:space="preserve">아래와 같이 Lua Filter 와</w:t>
+      </w:r>
+      <w:r>
+        <w:t xml:space="preserve"> </w:t>
+      </w:r>
+      <w:r>
+        <w:rPr>
+          <w:b/>
+          <w:bCs/>
+        </w:rPr>
+        <w:t xml:space="preserve">인식자/구분자</w:t>
+      </w:r>
+      <w:r>
+        <w:t xml:space="preserve"> </w:t>
+      </w:r>
+      <w:r>
+        <w:t xml:space="preserve">정하고, 그에 맞게 Lua filter Script 작성</w:t>
+      </w:r>
+      <w:r>
+        <w:br/>
+      </w:r>
+      <w:r>
+        <w:t xml:space="preserve">꼭</w:t>
+      </w:r>
+      <w:r>
+        <w:t xml:space="preserve"> </w:t>
+      </w:r>
+      <w:r>
+        <w:rPr>
+          <w:b/>
+          <w:bCs/>
+        </w:rPr>
+        <w:t xml:space="preserve">:::</w:t>
+      </w:r>
+      <w:r>
+        <w:t xml:space="preserve"> </w:t>
+      </w:r>
+      <w:r>
+        <w:t xml:space="preserve">필요는 없으며 각 부분을 정하고 하면 됨</w:t>
+      </w:r>
+    </w:p>
+    <w:p>
+      <w:pPr>
+        <w:pStyle w:val="FirstParagraph"/>
+      </w:pPr>
+    </w:p>
+    <w:p>
+      <w:pPr>
+        <w:pStyle w:val="a0"/>
+      </w:pPr>
+      <w:r>
+        <w:t xml:space="preserve">아니면, 인식자/구분자 없이 무조건적으로 넣는 것을 해도 될 듯하다.</w:t>
+      </w:r>
+    </w:p>
+    <w:p>
+      <w:pPr>
+        <w:pStyle w:val="a0"/>
+      </w:pPr>
+    </w:p>
+    <w:p>
+      <w:pPr>
+        <w:pStyle w:val="a0"/>
+      </w:pPr>
+      <w:r>
+        <w:t xml:space="preserve">가급적</w:t>
+      </w:r>
+      <w:r>
+        <w:t xml:space="preserve"> </w:t>
+      </w:r>
+      <w:r>
+        <w:rPr>
+          <w:b/>
+          <w:bCs/>
+        </w:rPr>
+        <w:t xml:space="preserve">Markdown에서 사용하는 것을 피하는 것</w:t>
+      </w:r>
+      <w:r>
+        <w:t xml:space="preserve"> </w:t>
+      </w:r>
+      <w:r>
+        <w:t xml:space="preserve">이 좋은 것 같다.</w:t>
+      </w:r>
+    </w:p>
+    <w:p>
+      <w:pPr>
+        <w:pStyle w:val="a0"/>
+      </w:pPr>
+    </w:p>
+    <w:p>
+      <w:pPr>
+        <w:pStyle w:val="a0"/>
+      </w:pPr>
+      <w:r>
+        <w:t xml:space="preserve">Lua Filter Script을 보면 div 기반으로 사용하므로, DOCX가 아니라면,</w:t>
+      </w:r>
+      <w:r>
+        <w:br/>
+      </w:r>
+      <w:r>
+        <w:t xml:space="preserve">HTML 로 한다면, CSS까지 나중에 고려 해도 될 듯하다.</w:t>
+      </w:r>
+    </w:p>
+    <w:p>
+      <w:pPr>
+        <w:pStyle w:val="a0"/>
+      </w:pPr>
+    </w:p>
+    <w:bookmarkStart w:id="122" w:name="lua-filter-script-a"/>
+    <w:p>
+      <w:pPr>
+        <w:pStyle w:val="3"/>
+      </w:pPr>
+      <w:r>
+        <w:rPr>
+          <w:rStyle w:val="SectionNumber"/>
+        </w:rPr>
+        <w:t xml:space="preserve">7.1</w:t>
+      </w:r>
+      <w:r>
+        <w:tab/>
+      </w:r>
+      <w:r>
+        <w:t xml:space="preserve">Lua Filter Script-A</w:t>
+      </w:r>
+    </w:p>
+    <w:p>
+      <w:pPr>
+        <w:pStyle w:val="Compact"/>
+        <w:numPr>
+          <w:ilvl w:val="0"/>
+          <w:numId w:val="1043"/>
+        </w:numPr>
+      </w:pPr>
+      <w:r>
+        <w:rPr>
+          <w:b/>
+          <w:bCs/>
+        </w:rPr>
+        <w:t xml:space="preserve">TEST Lua Filter-1</w:t>
+      </w:r>
+    </w:p>
+    <w:p>
+      <w:pPr>
+        <w:pStyle w:val="FirstParagraph"/>
+      </w:pPr>
+    </w:p>
+    <w:bookmarkEnd w:id="122"/>
+    <w:bookmarkStart w:id="123" w:name="lua-filter-script-b"/>
+    <w:p>
+      <w:pPr>
+        <w:pStyle w:val="3"/>
+      </w:pPr>
+      <w:r>
+        <w:rPr>
+          <w:rStyle w:val="SectionNumber"/>
+        </w:rPr>
+        <w:t xml:space="preserve">7.2</w:t>
+      </w:r>
+      <w:r>
+        <w:tab/>
+      </w:r>
+      <w:r>
+        <w:t xml:space="preserve">Lua Filter Script-B</w:t>
+      </w:r>
+    </w:p>
+    <w:p>
+      <w:pPr>
+        <w:pStyle w:val="Compact"/>
+        <w:numPr>
+          <w:ilvl w:val="0"/>
+          <w:numId w:val="1044"/>
+        </w:numPr>
+      </w:pPr>
+      <w:r>
+        <w:rPr>
+          <w:b/>
+          <w:bCs/>
+        </w:rPr>
+        <w:t xml:space="preserve">TEST Lua Filter-2</w:t>
+      </w:r>
+    </w:p>
+    <w:p>
+      <w:pPr>
+        <w:pStyle w:val="FirstParagraph"/>
+      </w:pPr>
+      <w:r>
+        <w:t xml:space="preserve">아래 소스 위치를 –resource-path 찾지 못하고, Project Root 에서 찾음</w:t>
+      </w:r>
+    </w:p>
+    <w:p>
+      <w:pPr>
+        <w:pStyle w:val="a0"/>
+      </w:pPr>
+    </w:p>
+    <w:bookmarkEnd w:id="123"/>
+    <w:bookmarkStart w:id="124" w:name="pandoc-args"/>
+    <w:p>
+      <w:pPr>
+        <w:pStyle w:val="3"/>
+      </w:pPr>
+      <w:r>
+        <w:rPr>
+          <w:rStyle w:val="SectionNumber"/>
+        </w:rPr>
+        <w:t xml:space="preserve">7.3</w:t>
+      </w:r>
+      <w:r>
+        <w:tab/>
+      </w:r>
+      <w:r>
+        <w:t xml:space="preserve">Pandoc Args</w:t>
+      </w:r>
+    </w:p>
+    <w:p>
+      <w:pPr>
+        <w:pStyle w:val="FirstParagraph"/>
+      </w:pPr>
+    </w:p>
+    <w:p>
+      <w:pPr>
+        <w:pStyle w:val="Compact"/>
+        <w:numPr>
+          <w:ilvl w:val="0"/>
+          <w:numId w:val="1045"/>
+        </w:numPr>
+      </w:pPr>
+      <w:r>
+        <w:rPr>
+          <w:b/>
+          <w:bCs/>
+        </w:rPr>
+        <w:t xml:space="preserve">VS Code Task</w:t>
+      </w:r>
+      <w:r>
+        <w:br/>
+      </w:r>
+      <w:r>
+        <w:t xml:space="preserve">Pandoc args에 아래와 같이 각 Lua filter 적용</w:t>
+      </w:r>
+      <w:r>
+        <w:br/>
+      </w:r>
+    </w:p>
+    <w:p>
+      <w:pPr>
+        <w:pStyle w:val="SourceCode"/>
+      </w:pPr>
+      <w:r>
+        <w:rPr>
+          <w:rStyle w:val="VerbatimChar"/>
+        </w:rPr>
+        <w:t xml:space="preserve">                ".\\docs\\tool_pandoc.md",</w:t>
+      </w:r>
+      <w:r>
+        <w:br/>
+      </w:r>
+      <w:r>
+        <w:rPr>
+          <w:rStyle w:val="VerbatimChar"/>
+        </w:rPr>
+        <w:t xml:space="preserve">                "--toc",</w:t>
+      </w:r>
+      <w:r>
+        <w:br/>
+      </w:r>
+      <w:r>
+        <w:rPr>
+          <w:rStyle w:val="VerbatimChar"/>
+        </w:rPr>
+        <w:t xml:space="preserve">                "--number-sections",</w:t>
+      </w:r>
+      <w:r>
+        <w:br/>
+      </w:r>
+      <w:r>
+        <w:rPr>
+          <w:rStyle w:val="VerbatimChar"/>
+        </w:rPr>
+        <w:t xml:space="preserve">                "--lua-filter=.\\docx\\lua\\signature.lua",</w:t>
+      </w:r>
+      <w:r>
+        <w:br/>
+      </w:r>
+      <w:r>
+        <w:rPr>
+          <w:rStyle w:val="VerbatimChar"/>
+        </w:rPr>
+        <w:t xml:space="preserve">                "--lua-filter=.\\docx\\lua\\information.lua",                </w:t>
+      </w:r>
+      <w:r>
+        <w:br/>
+      </w:r>
+      <w:r>
+        <w:rPr>
+          <w:rStyle w:val="VerbatimChar"/>
+        </w:rPr>
+        <w:t xml:space="preserve">                "--reference-doc=.\\docx\\reference.docx",</w:t>
+      </w:r>
+      <w:r>
+        <w:br/>
+      </w:r>
+      <w:r>
+        <w:rPr>
+          <w:rStyle w:val="VerbatimChar"/>
+        </w:rPr>
+        <w:t xml:space="preserve">                "--resource-path=.\\docs",</w:t>
+      </w:r>
+      <w:r>
+        <w:br/>
+      </w:r>
+      <w:r>
+        <w:rPr>
+          <w:rStyle w:val="VerbatimChar"/>
+        </w:rPr>
+        <w:t xml:space="preserve">                "-o",``</w:t>
+      </w:r>
+      <w:r>
+        <w:br/>
+      </w:r>
+      <w:r>
+        <w:rPr>
+          <w:rStyle w:val="VerbatimChar"/>
+        </w:rPr>
+        <w:t xml:space="preserve">                ".\\docx\\tool_pandoc.docx"</w:t>
+      </w:r>
+    </w:p>
+    <w:bookmarkEnd w:id="124"/>
+    <w:bookmarkEnd w:id="125"/>
     <w:sectPr>
-      <w:headerReference r:id="rId25" w:type="default"/>
-      <w:footerReference r:id="rId26" w:type="default"/>
+      <w:headerReference r:id="rId26" w:type="default"/>
+      <w:footerReference r:id="rId27" w:type="default"/>
       <w:footnotePr>
         <w:numRestart w:val="eachSect"/>
       </w:footnotePr>
@@ -3983,6 +5024,48 @@
   <w:num w:numId="1031">
     <w:abstractNumId w:val="991"/>
   </w:num>
+  <w:num w:numId="1032">
+    <w:abstractNumId w:val="991"/>
+  </w:num>
+  <w:num w:numId="1033">
+    <w:abstractNumId w:val="991"/>
+  </w:num>
+  <w:num w:numId="1034">
+    <w:abstractNumId w:val="991"/>
+  </w:num>
+  <w:num w:numId="1035">
+    <w:abstractNumId w:val="991"/>
+  </w:num>
+  <w:num w:numId="1036">
+    <w:abstractNumId w:val="991"/>
+  </w:num>
+  <w:num w:numId="1037">
+    <w:abstractNumId w:val="991"/>
+  </w:num>
+  <w:num w:numId="1038">
+    <w:abstractNumId w:val="991"/>
+  </w:num>
+  <w:num w:numId="1039">
+    <w:abstractNumId w:val="991"/>
+  </w:num>
+  <w:num w:numId="1040">
+    <w:abstractNumId w:val="991"/>
+  </w:num>
+  <w:num w:numId="1041">
+    <w:abstractNumId w:val="991"/>
+  </w:num>
+  <w:num w:numId="1042">
+    <w:abstractNumId w:val="991"/>
+  </w:num>
+  <w:num w:numId="1043">
+    <w:abstractNumId w:val="991"/>
+  </w:num>
+  <w:num w:numId="1044">
+    <w:abstractNumId w:val="991"/>
+  </w:num>
+  <w:num w:numId="1045">
+    <w:abstractNumId w:val="991"/>
+  </w:num>
 </w:numbering>
 </file>
 
@@ -4281,10 +5364,9 @@
     <w:next w:val="a0"/>
     <w:link w:val="2Char"/>
     <w:uiPriority w:val="9"/>
-    <w:semiHidden/>
     <w:unhideWhenUsed/>
     <w:qFormat/>
-    <w:rsid w:val="00580853"/>
+    <w:rsid w:val="000B78AA"/>
     <w:pPr>
       <w:keepNext/>
       <w:keepLines/>
@@ -4292,7 +5374,7 @@
       <w:outlineLvl w:val="1"/>
     </w:pPr>
     <w:rPr>
-      <w:rFonts w:asciiTheme="majorHAnsi" w:cstheme="majorBidi" w:eastAsiaTheme="majorEastAsia" w:hAnsiTheme="majorHAnsi"/>
+      <w:rFonts w:ascii="맑은 고딕" w:cstheme="majorBidi" w:eastAsia="맑은 고딕" w:hAnsi="맑은 고딕"/>
       <w:b/>
       <w:color w:themeColor="accent1" w:themeShade="BF" w:val="0F4761"/>
       <w:sz w:val="32"/>
@@ -4305,10 +5387,9 @@
     <w:next w:val="a0"/>
     <w:link w:val="3Char"/>
     <w:uiPriority w:val="9"/>
-    <w:semiHidden/>
     <w:unhideWhenUsed/>
     <w:qFormat/>
-    <w:rsid w:val="00580853"/>
+    <w:rsid w:val="0065128E"/>
     <w:pPr>
       <w:keepNext/>
       <w:keepLines/>
@@ -4651,10 +5732,9 @@
     <w:basedOn w:val="a1"/>
     <w:link w:val="2"/>
     <w:uiPriority w:val="9"/>
-    <w:semiHidden/>
-    <w:rsid w:val="00580853"/>
+    <w:rsid w:val="000B78AA"/>
     <w:rPr>
-      <w:rFonts w:asciiTheme="majorHAnsi" w:cstheme="majorBidi" w:eastAsiaTheme="majorEastAsia" w:hAnsiTheme="majorHAnsi"/>
+      <w:rFonts w:ascii="맑은 고딕" w:cstheme="majorBidi" w:eastAsia="맑은 고딕" w:hAnsi="맑은 고딕"/>
       <w:b/>
       <w:color w:themeColor="accent1" w:themeShade="BF" w:val="0F4761"/>
       <w:sz w:val="32"/>
@@ -4666,8 +5746,7 @@
     <w:basedOn w:val="a1"/>
     <w:link w:val="3"/>
     <w:uiPriority w:val="9"/>
-    <w:semiHidden/>
-    <w:rsid w:val="00580853"/>
+    <w:rsid w:val="0065128E"/>
     <w:rPr>
       <w:rFonts w:cstheme="majorBidi" w:eastAsiaTheme="majorEastAsia"/>
       <w:b/>
@@ -4922,9 +6001,11 @@
     <w:name w:val="Hyperlink"/>
     <w:basedOn w:val="Char1"/>
     <w:uiPriority w:val="99"/>
-    <w:rsid w:val="00370D00"/>
+    <w:rsid w:val="00BA370A"/>
     <w:rPr>
-      <w:rFonts w:eastAsia="맑은 고딕"/>
+      <w:rFonts w:ascii="맑은 고딕" w:eastAsia="맑은 고딕" w:hAnsi="맑은 고딕"/>
+      <w:b/>
+      <w:i w:val="0"/>
       <w:color w:themeColor="accent1" w:val="156082"/>
       <w:sz w:val="24"/>
     </w:rPr>
@@ -4936,14 +6017,15 @@
     <w:uiPriority w:val="39"/>
     <w:unhideWhenUsed/>
     <w:qFormat/>
-    <w:rsid w:val="005B692B"/>
+    <w:rsid w:val="00E42BA7"/>
     <w:pPr>
       <w:spacing w:before="240" w:line="259" w:lineRule="auto"/>
       <w:outlineLvl w:val="9"/>
     </w:pPr>
     <w:rPr>
+      <w:rFonts w:ascii="맑은고딕" w:eastAsia="맑은고딕"/>
       <w:b/>
-      <w:sz w:val="36"/>
+      <w:sz w:val="32"/>
     </w:rPr>
   </w:style>
   <w:style w:styleId="ad" w:type="paragraph">
@@ -5324,9 +6406,10 @@
     <w:next w:val="a"/>
     <w:autoRedefine/>
     <w:uiPriority w:val="39"/>
-    <w:rsid w:val="00F167E4"/>
+    <w:rsid w:val="00EA300F"/>
     <w:pPr>
-      <w:ind w:left="425" w:leftChars="200"/>
+      <w:spacing w:after="120"/>
+      <w:ind w:left="200" w:leftChars="200"/>
     </w:pPr>
   </w:style>
   <w:style w:styleId="30" w:type="paragraph">
@@ -5338,6 +6421,25 @@
     <w:rsid w:val="00F167E4"/>
     <w:pPr>
       <w:ind w:left="850" w:leftChars="400"/>
+    </w:pPr>
+  </w:style>
+  <w:style w:styleId="af" w:type="character">
+    <w:name w:val="FollowedHyperlink"/>
+    <w:basedOn w:val="a1"/>
+    <w:rsid w:val="00EA300F"/>
+    <w:rPr>
+      <w:color w:themeColor="followedHyperlink" w:val="96607D"/>
+      <w:u w:val="single"/>
+    </w:rPr>
+  </w:style>
+  <w:style w:styleId="10" w:type="paragraph">
+    <w:name w:val="toc 1"/>
+    <w:basedOn w:val="a"/>
+    <w:next w:val="a"/>
+    <w:autoRedefine/>
+    <w:rsid w:val="00EA300F"/>
+    <w:pPr>
+      <w:spacing w:after="120"/>
     </w:pPr>
   </w:style>
 </w:styles>

</xml_diff>